<commit_message>
add explanations + usage for each of 100 prompts
</commit_message>
<xml_diff>
--- a/promptgenius/pack-prompts-ia.docx
+++ b/promptgenius/pack-prompts-ia.docx
@@ -24,7 +24,7 @@
           <w:color w:val="666666"/>
           <w:sz w:val="26"/>
         </w:rPr>
-        <w:t>100 prompts testés pour coder, créer et vendre plus vite</w:t>
+        <w:t>100 prompts expliqués - Code, SaaS, Marketing, Meta-prompts</w:t>
       </w:r>
     </w:p>
     <w:p>
@@ -36,7 +36,19 @@
           <w:color w:val="999999"/>
           <w:sz w:val="20"/>
         </w:rPr>
-        <w:t>UcfZem — ucfzem.github.io</w:t>
+        <w:t>Avec explications détaillées et cas d'usage pour chaque prompt</w:t>
+      </w:r>
+    </w:p>
+    <w:p>
+      <w:pPr>
+        <w:jc w:val="center"/>
+      </w:pPr>
+      <w:r>
+        <w:rPr>
+          <w:color w:val="BBBBBB"/>
+          <w:sz w:val="18"/>
+        </w:rPr>
+        <w:t>UcfZem - ucfzem.github.io</w:t>
       </w:r>
     </w:p>
     <w:p>
@@ -57,39 +69,36 @@
     <w:p>
       <w:r>
         <w:rPr>
-          <w:color w:val="333333"/>
           <w:sz w:val="22"/>
         </w:rPr>
-        <w:t>01    Prompts Code — React, Workers, APIs</w:t>
+        <w:t>01    Prompts Code - React, Workers, APIs</w:t>
       </w:r>
       <w:r>
         <w:rPr>
           <w:color w:val="AAAAAA"/>
-          <w:sz w:val="18"/>
-        </w:rPr>
-        <w:t xml:space="preserve">    30 prompts</w:t>
-      </w:r>
-    </w:p>
-    <w:p>
-      <w:r>
-        <w:rPr>
-          <w:color w:val="333333"/>
+          <w:sz w:val="16"/>
+        </w:rPr>
+        <w:t xml:space="preserve">    (30 prompts)</w:t>
+      </w:r>
+    </w:p>
+    <w:p>
+      <w:r>
+        <w:rPr>
           <w:sz w:val="22"/>
         </w:rPr>
-        <w:t>02    Prompts SaaS — Idées &amp; Validation</w:t>
+        <w:t>02    Prompts SaaS - Idees &amp; Validation</w:t>
       </w:r>
       <w:r>
         <w:rPr>
           <w:color w:val="AAAAAA"/>
-          <w:sz w:val="18"/>
-        </w:rPr>
-        <w:t xml:space="preserve">    25 prompts</w:t>
-      </w:r>
-    </w:p>
-    <w:p>
-      <w:r>
-        <w:rPr>
-          <w:color w:val="333333"/>
+          <w:sz w:val="16"/>
+        </w:rPr>
+        <w:t xml:space="preserve">    (25 prompts)</w:t>
+      </w:r>
+    </w:p>
+    <w:p>
+      <w:r>
+        <w:rPr>
           <w:sz w:val="22"/>
         </w:rPr>
         <w:t>03    Prompts Marketing &amp; Blog</w:t>
@@ -97,25 +106,24 @@
       <w:r>
         <w:rPr>
           <w:color w:val="AAAAAA"/>
-          <w:sz w:val="18"/>
-        </w:rPr>
-        <w:t xml:space="preserve">    30 prompts</w:t>
-      </w:r>
-    </w:p>
-    <w:p>
-      <w:r>
-        <w:rPr>
-          <w:color w:val="333333"/>
+          <w:sz w:val="16"/>
+        </w:rPr>
+        <w:t xml:space="preserve">    (30 prompts)</w:t>
+      </w:r>
+    </w:p>
+    <w:p>
+      <w:r>
+        <w:rPr>
           <w:sz w:val="22"/>
         </w:rPr>
-        <w:t>04    Bonus — Meta-prompts</w:t>
+        <w:t>04    Bonus - Meta-prompts</w:t>
       </w:r>
       <w:r>
         <w:rPr>
           <w:color w:val="AAAAAA"/>
-          <w:sz w:val="18"/>
-        </w:rPr>
-        <w:t xml:space="preserve">    15 prompts</w:t>
+          <w:sz w:val="16"/>
+        </w:rPr>
+        <w:t xml:space="preserve">    (15 prompts)</w:t>
       </w:r>
     </w:p>
     <w:p>
@@ -130,6 +138,4476 @@
           <w:color w:val="D4A017"/>
           <w:sz w:val="28"/>
         </w:rPr>
+        <w:t>Prompts Code — React, Workers, APIs (30 prompts)</w:t>
+      </w:r>
+    </w:p>
+    <w:p>
+      <w:r>
+        <w:rPr>
+          <w:b/>
+          <w:color w:val="D4A017"/>
+          <w:sz w:val="18"/>
+        </w:rPr>
+        <w:t xml:space="preserve">#1  </w:t>
+      </w:r>
+      <w:r>
+        <w:rPr>
+          <w:i/>
+          <w:color w:val="333333"/>
+          <w:sz w:val="19"/>
+        </w:rPr>
+        <w:t>"Crée un composant React [textarea/input] avec compteur de caractères, limite configurable, et indicateur visuel quand on approche de la limite. Style tailwind."</w:t>
+      </w:r>
+    </w:p>
+    <w:p>
+      <w:r>
+        <w:rPr>
+          <w:b/>
+          <w:color w:val="D4A017"/>
+          <w:sz w:val="17"/>
+        </w:rPr>
+        <w:t xml:space="preserve">Explication : </w:t>
+      </w:r>
+      <w:r>
+        <w:rPr>
+          <w:color w:val="555555"/>
+          <w:sz w:val="17"/>
+        </w:rPr>
+        <w:t>Génère un champ de saisie avec compteur en temps réel. La limite est paramétrable et un warning visuel apparaît quand on s'approche de la limite.</w:t>
+      </w:r>
+    </w:p>
+    <w:p>
+      <w:r>
+        <w:rPr>
+          <w:b/>
+          <w:color w:val="D4A017"/>
+          <w:sz w:val="17"/>
+        </w:rPr>
+        <w:t xml:space="preserve">Utilise pour : </w:t>
+      </w:r>
+      <w:r>
+        <w:rPr>
+          <w:color w:val="555555"/>
+          <w:sz w:val="17"/>
+        </w:rPr>
+        <w:t>Formulaires, saisie de tweets, bios, descriptions produit, commentaires</w:t>
+      </w:r>
+    </w:p>
+    <w:p>
+      <w:pPr>
+        <w:pBdr>
+          <w:bottom w:val="single" w:sz="4" w:space="4" w:color="EEEEEE"/>
+        </w:pBdr>
+      </w:pPr>
+    </w:p>
+    <w:p>
+      <w:r>
+        <w:rPr>
+          <w:b/>
+          <w:color w:val="D4A017"/>
+          <w:sz w:val="18"/>
+        </w:rPr>
+        <w:t xml:space="preserve">#2  </w:t>
+      </w:r>
+      <w:r>
+        <w:rPr>
+          <w:i/>
+          <w:color w:val="333333"/>
+          <w:sz w:val="19"/>
+        </w:rPr>
+        <w:t>"Génère un hook React useLocalStorage avec support SSR, écouteur d'événement storage pour synchro entre onglets, et valeur par défaut typée."</w:t>
+      </w:r>
+    </w:p>
+    <w:p>
+      <w:r>
+        <w:rPr>
+          <w:b/>
+          <w:color w:val="D4A017"/>
+          <w:sz w:val="17"/>
+        </w:rPr>
+        <w:t xml:space="preserve">Explication : </w:t>
+      </w:r>
+      <w:r>
+        <w:rPr>
+          <w:color w:val="555555"/>
+          <w:sz w:val="17"/>
+        </w:rPr>
+        <w:t>Crée un hook personnalisé qui agit comme useState mais persisté dans localStorage avec synchro inter-onglets.</w:t>
+      </w:r>
+    </w:p>
+    <w:p>
+      <w:r>
+        <w:rPr>
+          <w:b/>
+          <w:color w:val="D4A017"/>
+          <w:sz w:val="17"/>
+        </w:rPr>
+        <w:t xml:space="preserve">Utilise pour : </w:t>
+      </w:r>
+      <w:r>
+        <w:rPr>
+          <w:color w:val="555555"/>
+          <w:sz w:val="17"/>
+        </w:rPr>
+        <w:t>Thème dark/light, préférences utilisateur, panier, brouillons, state persistant</w:t>
+      </w:r>
+    </w:p>
+    <w:p>
+      <w:pPr>
+        <w:pBdr>
+          <w:bottom w:val="single" w:sz="4" w:space="4" w:color="EEEEEE"/>
+        </w:pBdr>
+      </w:pPr>
+    </w:p>
+    <w:p>
+      <w:r>
+        <w:rPr>
+          <w:b/>
+          <w:color w:val="D4A017"/>
+          <w:sz w:val="18"/>
+        </w:rPr>
+        <w:t xml:space="preserve">#3  </w:t>
+      </w:r>
+      <w:r>
+        <w:rPr>
+          <w:i/>
+          <w:color w:val="333333"/>
+          <w:sz w:val="19"/>
+        </w:rPr>
+        <w:t>"Composant React Modal avec : portail, fermeture au click outside, animation CSS, focus trap, accessible (ARIA)."</w:t>
+      </w:r>
+    </w:p>
+    <w:p>
+      <w:r>
+        <w:rPr>
+          <w:b/>
+          <w:color w:val="D4A017"/>
+          <w:sz w:val="17"/>
+        </w:rPr>
+        <w:t xml:space="preserve">Explication : </w:t>
+      </w:r>
+      <w:r>
+        <w:rPr>
+          <w:color w:val="555555"/>
+          <w:sz w:val="17"/>
+        </w:rPr>
+        <w:t>Boîte modale complète avec React Portal, fermeture au clic dehors, piège du focus clavier, normes ARIA.</w:t>
+      </w:r>
+    </w:p>
+    <w:p>
+      <w:r>
+        <w:rPr>
+          <w:b/>
+          <w:color w:val="D4A017"/>
+          <w:sz w:val="17"/>
+        </w:rPr>
+        <w:t xml:space="preserve">Utilise pour : </w:t>
+      </w:r>
+      <w:r>
+        <w:rPr>
+          <w:color w:val="555555"/>
+          <w:sz w:val="17"/>
+        </w:rPr>
+        <w:t>Alertes, confirmations, formulaires popup, galeries, overlays accessibles</w:t>
+      </w:r>
+    </w:p>
+    <w:p>
+      <w:pPr>
+        <w:pBdr>
+          <w:bottom w:val="single" w:sz="4" w:space="4" w:color="EEEEEE"/>
+        </w:pBdr>
+      </w:pPr>
+    </w:p>
+    <w:p>
+      <w:r>
+        <w:rPr>
+          <w:b/>
+          <w:color w:val="D4A017"/>
+          <w:sz w:val="18"/>
+        </w:rPr>
+        <w:t xml:space="preserve">#4  </w:t>
+      </w:r>
+      <w:r>
+        <w:rPr>
+          <w:i/>
+          <w:color w:val="333333"/>
+          <w:sz w:val="19"/>
+        </w:rPr>
+        <w:t>"Crée un composant InfiniteScroll qui détecte la fin de page, appelle une API, et gère les états loading/error/empty."</w:t>
+      </w:r>
+    </w:p>
+    <w:p>
+      <w:r>
+        <w:rPr>
+          <w:b/>
+          <w:color w:val="D4A017"/>
+          <w:sz w:val="17"/>
+        </w:rPr>
+        <w:t xml:space="preserve">Explication : </w:t>
+      </w:r>
+      <w:r>
+        <w:rPr>
+          <w:color w:val="555555"/>
+          <w:sz w:val="17"/>
+        </w:rPr>
+        <w:t>Détecte la fin de page, déclenche un chargement asynchrone, gère les états loading/error/empty.</w:t>
+      </w:r>
+    </w:p>
+    <w:p>
+      <w:r>
+        <w:rPr>
+          <w:b/>
+          <w:color w:val="D4A017"/>
+          <w:sz w:val="17"/>
+        </w:rPr>
+        <w:t xml:space="preserve">Utilise pour : </w:t>
+      </w:r>
+      <w:r>
+        <w:rPr>
+          <w:color w:val="555555"/>
+          <w:sz w:val="17"/>
+        </w:rPr>
+        <w:t>Flux d'actualités, recherche infinie, listes produits, timeline réseaux sociaux</w:t>
+      </w:r>
+    </w:p>
+    <w:p>
+      <w:pPr>
+        <w:pBdr>
+          <w:bottom w:val="single" w:sz="4" w:space="4" w:color="EEEEEE"/>
+        </w:pBdr>
+      </w:pPr>
+    </w:p>
+    <w:p>
+      <w:r>
+        <w:rPr>
+          <w:b/>
+          <w:color w:val="D4A017"/>
+          <w:sz w:val="18"/>
+        </w:rPr>
+        <w:t xml:space="preserve">#5  </w:t>
+      </w:r>
+      <w:r>
+        <w:rPr>
+          <w:i/>
+          <w:color w:val="333333"/>
+          <w:sz w:val="19"/>
+        </w:rPr>
+        <w:t>"Composant React ImageWithFallback : src principal, fallback, loading spinner, lazy loading, détection WebP."</w:t>
+      </w:r>
+    </w:p>
+    <w:p>
+      <w:r>
+        <w:rPr>
+          <w:b/>
+          <w:color w:val="D4A017"/>
+          <w:sz w:val="17"/>
+        </w:rPr>
+        <w:t xml:space="preserve">Explication : </w:t>
+      </w:r>
+      <w:r>
+        <w:rPr>
+          <w:color w:val="555555"/>
+          <w:sz w:val="17"/>
+        </w:rPr>
+        <w:t>Affiche une image avec fallback en cas d'erreur, lazy loading natif, détection WebP.</w:t>
+      </w:r>
+    </w:p>
+    <w:p>
+      <w:r>
+        <w:rPr>
+          <w:b/>
+          <w:color w:val="D4A017"/>
+          <w:sz w:val="17"/>
+        </w:rPr>
+        <w:t xml:space="preserve">Utilise pour : </w:t>
+      </w:r>
+      <w:r>
+        <w:rPr>
+          <w:color w:val="555555"/>
+          <w:sz w:val="17"/>
+        </w:rPr>
+        <w:t>Profils, galeries, avatars, images produit, fallback visuel</w:t>
+      </w:r>
+    </w:p>
+    <w:p>
+      <w:pPr>
+        <w:pBdr>
+          <w:bottom w:val="single" w:sz="4" w:space="4" w:color="EEEEEE"/>
+        </w:pBdr>
+      </w:pPr>
+    </w:p>
+    <w:p>
+      <w:r>
+        <w:rPr>
+          <w:b/>
+          <w:color w:val="D4A017"/>
+          <w:sz w:val="18"/>
+        </w:rPr>
+        <w:t xml:space="preserve">#6  </w:t>
+      </w:r>
+      <w:r>
+        <w:rPr>
+          <w:i/>
+          <w:color w:val="333333"/>
+          <w:sz w:val="19"/>
+        </w:rPr>
+        <w:t>"Génère un sélecteur de thème (dark/light/system) avec persistence localStorage, transition smooth, et icône dynamique."</w:t>
+      </w:r>
+    </w:p>
+    <w:p>
+      <w:r>
+        <w:rPr>
+          <w:b/>
+          <w:color w:val="D4A017"/>
+          <w:sz w:val="17"/>
+        </w:rPr>
+        <w:t xml:space="preserve">Explication : </w:t>
+      </w:r>
+      <w:r>
+        <w:rPr>
+          <w:color w:val="555555"/>
+          <w:sz w:val="17"/>
+        </w:rPr>
+        <w:t>Toggle/selecteur qui suit la préférence système, sauvegarde dans localStorage, anime la transition.</w:t>
+      </w:r>
+    </w:p>
+    <w:p>
+      <w:r>
+        <w:rPr>
+          <w:b/>
+          <w:color w:val="D4A017"/>
+          <w:sz w:val="17"/>
+        </w:rPr>
+        <w:t xml:space="preserve">Utilise pour : </w:t>
+      </w:r>
+      <w:r>
+        <w:rPr>
+          <w:color w:val="555555"/>
+          <w:sz w:val="17"/>
+        </w:rPr>
+        <w:t>Apps dark mode, dashboards, sites multi-thèmes, UX accessible</w:t>
+      </w:r>
+    </w:p>
+    <w:p>
+      <w:pPr>
+        <w:pBdr>
+          <w:bottom w:val="single" w:sz="4" w:space="4" w:color="EEEEEE"/>
+        </w:pBdr>
+      </w:pPr>
+    </w:p>
+    <w:p>
+      <w:r>
+        <w:rPr>
+          <w:b/>
+          <w:color w:val="D4A017"/>
+          <w:sz w:val="18"/>
+        </w:rPr>
+        <w:t xml:space="preserve">#7  </w:t>
+      </w:r>
+      <w:r>
+        <w:rPr>
+          <w:i/>
+          <w:color w:val="333333"/>
+          <w:sz w:val="19"/>
+        </w:rPr>
+        <w:t>"Composant ProgressBar animé avec pourcentage, couleur personnalisable, et variantes (déterminé, indéterminé, stripes)."</w:t>
+      </w:r>
+    </w:p>
+    <w:p>
+      <w:r>
+        <w:rPr>
+          <w:b/>
+          <w:color w:val="D4A017"/>
+          <w:sz w:val="17"/>
+        </w:rPr>
+        <w:t xml:space="preserve">Explication : </w:t>
+      </w:r>
+      <w:r>
+        <w:rPr>
+          <w:color w:val="555555"/>
+          <w:sz w:val="17"/>
+        </w:rPr>
+        <w:t>Barre de progression avec animations, couleur configurable, modes : fixe, indéterminé, rayé.</w:t>
+      </w:r>
+    </w:p>
+    <w:p>
+      <w:r>
+        <w:rPr>
+          <w:b/>
+          <w:color w:val="D4A017"/>
+          <w:sz w:val="17"/>
+        </w:rPr>
+        <w:t xml:space="preserve">Utilise pour : </w:t>
+      </w:r>
+      <w:r>
+        <w:rPr>
+          <w:color w:val="555555"/>
+          <w:sz w:val="17"/>
+        </w:rPr>
+        <w:t>Uploads, téléchargements, formulaires multi-étapes, chargement données</w:t>
+      </w:r>
+    </w:p>
+    <w:p>
+      <w:pPr>
+        <w:pBdr>
+          <w:bottom w:val="single" w:sz="4" w:space="4" w:color="EEEEEE"/>
+        </w:pBdr>
+      </w:pPr>
+    </w:p>
+    <w:p>
+      <w:r>
+        <w:rPr>
+          <w:b/>
+          <w:color w:val="D4A017"/>
+          <w:sz w:val="18"/>
+        </w:rPr>
+        <w:t xml:space="preserve">#8  </w:t>
+      </w:r>
+      <w:r>
+        <w:rPr>
+          <w:i/>
+          <w:color w:val="333333"/>
+          <w:sz w:val="19"/>
+        </w:rPr>
+        <w:t>"Crée un composant FileUpload avec : drag &amp; drop, prévisualisation, validation de type/taille, barre de progression upload."</w:t>
+      </w:r>
+    </w:p>
+    <w:p>
+      <w:r>
+        <w:rPr>
+          <w:b/>
+          <w:color w:val="D4A017"/>
+          <w:sz w:val="17"/>
+        </w:rPr>
+        <w:t xml:space="preserve">Explication : </w:t>
+      </w:r>
+      <w:r>
+        <w:rPr>
+          <w:color w:val="555555"/>
+          <w:sz w:val="17"/>
+        </w:rPr>
+        <w:t>Zone de dépôt avec glisser-déposer, aperçu, validation client, barre de progression upload.</w:t>
+      </w:r>
+    </w:p>
+    <w:p>
+      <w:r>
+        <w:rPr>
+          <w:b/>
+          <w:color w:val="D4A017"/>
+          <w:sz w:val="17"/>
+        </w:rPr>
+        <w:t xml:space="preserve">Utilise pour : </w:t>
+      </w:r>
+      <w:r>
+        <w:rPr>
+          <w:color w:val="555555"/>
+          <w:sz w:val="17"/>
+        </w:rPr>
+        <w:t>CVthèques, galeries, formulaires avec pièces jointes, dashboards</w:t>
+      </w:r>
+    </w:p>
+    <w:p>
+      <w:pPr>
+        <w:pBdr>
+          <w:bottom w:val="single" w:sz="4" w:space="4" w:color="EEEEEE"/>
+        </w:pBdr>
+      </w:pPr>
+    </w:p>
+    <w:p>
+      <w:r>
+        <w:rPr>
+          <w:b/>
+          <w:color w:val="D4A017"/>
+          <w:sz w:val="18"/>
+        </w:rPr>
+        <w:t xml:space="preserve">#9  </w:t>
+      </w:r>
+      <w:r>
+        <w:rPr>
+          <w:i/>
+          <w:color w:val="333333"/>
+          <w:sz w:val="19"/>
+        </w:rPr>
+        <w:t>"Composant Accordéon/Tabs accessible avec ARIA, animation hauteur automatique, et mode contrôlé/non-contrôlé."</w:t>
+      </w:r>
+    </w:p>
+    <w:p>
+      <w:r>
+        <w:rPr>
+          <w:b/>
+          <w:color w:val="D4A017"/>
+          <w:sz w:val="17"/>
+        </w:rPr>
+        <w:t xml:space="preserve">Explication : </w:t>
+      </w:r>
+      <w:r>
+        <w:rPr>
+          <w:color w:val="555555"/>
+          <w:sz w:val="17"/>
+        </w:rPr>
+        <w:t>Système d'accordéon/onglets avec animations, navigation clavier, ARIA, modes contrôlé/autonome.</w:t>
+      </w:r>
+    </w:p>
+    <w:p>
+      <w:r>
+        <w:rPr>
+          <w:b/>
+          <w:color w:val="D4A017"/>
+          <w:sz w:val="17"/>
+        </w:rPr>
+        <w:t xml:space="preserve">Utilise pour : </w:t>
+      </w:r>
+      <w:r>
+        <w:rPr>
+          <w:color w:val="555555"/>
+          <w:sz w:val="17"/>
+        </w:rPr>
+        <w:t>FAQ, documentation, paramètres, fiches produit, dashboards</w:t>
+      </w:r>
+    </w:p>
+    <w:p>
+      <w:pPr>
+        <w:pBdr>
+          <w:bottom w:val="single" w:sz="4" w:space="4" w:color="EEEEEE"/>
+        </w:pBdr>
+      </w:pPr>
+    </w:p>
+    <w:p>
+      <w:r>
+        <w:rPr>
+          <w:b/>
+          <w:color w:val="D4A017"/>
+          <w:sz w:val="18"/>
+        </w:rPr>
+        <w:t xml:space="preserve">#10  </w:t>
+      </w:r>
+      <w:r>
+        <w:rPr>
+          <w:i/>
+          <w:color w:val="333333"/>
+          <w:sz w:val="19"/>
+        </w:rPr>
+        <w:t>"Génère un composant Toast/Notification système avec file d'attente, auto-dismiss, positions configurables, et animations."</w:t>
+      </w:r>
+    </w:p>
+    <w:p>
+      <w:r>
+        <w:rPr>
+          <w:b/>
+          <w:color w:val="D4A017"/>
+          <w:sz w:val="17"/>
+        </w:rPr>
+        <w:t xml:space="preserve">Explication : </w:t>
+      </w:r>
+      <w:r>
+        <w:rPr>
+          <w:color w:val="555555"/>
+          <w:sz w:val="17"/>
+        </w:rPr>
+        <w:t>Notifications temporaires avec file d'attente, auto-disparition, positions au choix, animations.</w:t>
+      </w:r>
+    </w:p>
+    <w:p>
+      <w:r>
+        <w:rPr>
+          <w:b/>
+          <w:color w:val="D4A017"/>
+          <w:sz w:val="17"/>
+        </w:rPr>
+        <w:t xml:space="preserve">Utilise pour : </w:t>
+      </w:r>
+      <w:r>
+        <w:rPr>
+          <w:color w:val="555555"/>
+          <w:sz w:val="17"/>
+        </w:rPr>
+        <w:t>Succès/erreur, alertes système, feedback actions, notifications temps réel</w:t>
+      </w:r>
+    </w:p>
+    <w:p>
+      <w:pPr>
+        <w:pBdr>
+          <w:bottom w:val="single" w:sz="4" w:space="4" w:color="EEEEEE"/>
+        </w:pBdr>
+      </w:pPr>
+    </w:p>
+    <w:p>
+      <w:r>
+        <w:rPr>
+          <w:b/>
+          <w:color w:val="D4A017"/>
+          <w:sz w:val="18"/>
+        </w:rPr>
+        <w:t xml:space="preserve">#11  </w:t>
+      </w:r>
+      <w:r>
+        <w:rPr>
+          <w:i/>
+          <w:color w:val="333333"/>
+          <w:sz w:val="19"/>
+        </w:rPr>
+        <w:t>"Écris un Cloudflare Worker qui proxy une API externe avec : cache KV, rate limiting, CORS, et fallback en cas d'erreur."</w:t>
+      </w:r>
+    </w:p>
+    <w:p>
+      <w:r>
+        <w:rPr>
+          <w:b/>
+          <w:color w:val="D4A017"/>
+          <w:sz w:val="17"/>
+        </w:rPr>
+        <w:t xml:space="preserve">Explication : </w:t>
+      </w:r>
+      <w:r>
+        <w:rPr>
+          <w:color w:val="555555"/>
+          <w:sz w:val="17"/>
+        </w:rPr>
+        <w:t>Proxy serveur qui cache les réponses dans KV, limite le nombre de requêtes par IP, gère le CORS, avec fallback.</w:t>
+      </w:r>
+    </w:p>
+    <w:p>
+      <w:r>
+        <w:rPr>
+          <w:b/>
+          <w:color w:val="D4A017"/>
+          <w:sz w:val="17"/>
+        </w:rPr>
+        <w:t xml:space="preserve">Utilise pour : </w:t>
+      </w:r>
+      <w:r>
+        <w:rPr>
+          <w:color w:val="555555"/>
+          <w:sz w:val="17"/>
+        </w:rPr>
+        <w:t>Protéger des tokens API, agréger des APIs, réduire latence via cache</w:t>
+      </w:r>
+    </w:p>
+    <w:p>
+      <w:pPr>
+        <w:pBdr>
+          <w:bottom w:val="single" w:sz="4" w:space="4" w:color="EEEEEE"/>
+        </w:pBdr>
+      </w:pPr>
+    </w:p>
+    <w:p>
+      <w:r>
+        <w:rPr>
+          <w:b/>
+          <w:color w:val="D4A017"/>
+          <w:sz w:val="18"/>
+        </w:rPr>
+        <w:t xml:space="preserve">#12  </w:t>
+      </w:r>
+      <w:r>
+        <w:rPr>
+          <w:i/>
+          <w:color w:val="333333"/>
+          <w:sz w:val="19"/>
+        </w:rPr>
+        <w:t>"Worker avec D1 database : CRUD pour une collection 'users', validation Zod, et réponses JSON structurées."</w:t>
+      </w:r>
+    </w:p>
+    <w:p>
+      <w:r>
+        <w:rPr>
+          <w:b/>
+          <w:color w:val="D4A017"/>
+          <w:sz w:val="17"/>
+        </w:rPr>
+        <w:t xml:space="preserve">Explication : </w:t>
+      </w:r>
+      <w:r>
+        <w:rPr>
+          <w:color w:val="555555"/>
+          <w:sz w:val="17"/>
+        </w:rPr>
+        <w:t>API REST complète avec D1 : CRUD utilisateurs, validation Zod, réponses JSON standardisées.</w:t>
+      </w:r>
+    </w:p>
+    <w:p>
+      <w:r>
+        <w:rPr>
+          <w:b/>
+          <w:color w:val="D4A017"/>
+          <w:sz w:val="17"/>
+        </w:rPr>
+        <w:t xml:space="preserve">Utilise pour : </w:t>
+      </w:r>
+      <w:r>
+        <w:rPr>
+          <w:color w:val="555555"/>
+          <w:sz w:val="17"/>
+        </w:rPr>
+        <w:t>Backend sans serveur, micro-SaaS, prototypes rapides</w:t>
+      </w:r>
+    </w:p>
+    <w:p>
+      <w:pPr>
+        <w:pBdr>
+          <w:bottom w:val="single" w:sz="4" w:space="4" w:color="EEEEEE"/>
+        </w:pBdr>
+      </w:pPr>
+    </w:p>
+    <w:p>
+      <w:r>
+        <w:rPr>
+          <w:b/>
+          <w:color w:val="D4A017"/>
+          <w:sz w:val="18"/>
+        </w:rPr>
+        <w:t xml:space="preserve">#13  </w:t>
+      </w:r>
+      <w:r>
+        <w:rPr>
+          <w:i/>
+          <w:color w:val="333333"/>
+          <w:sz w:val="19"/>
+        </w:rPr>
+        <w:t>"Worker WebSocket : connexion persistante, heartbeat, broadcast à tous les clients connectés, gestion des reconnexions."</w:t>
+      </w:r>
+    </w:p>
+    <w:p>
+      <w:r>
+        <w:rPr>
+          <w:b/>
+          <w:color w:val="D4A017"/>
+          <w:sz w:val="17"/>
+        </w:rPr>
+        <w:t xml:space="preserve">Explication : </w:t>
+      </w:r>
+      <w:r>
+        <w:rPr>
+          <w:color w:val="555555"/>
+          <w:sz w:val="17"/>
+        </w:rPr>
+        <w:t>Serveur WebSocket : connexions persistantes, heartbeat, broadcast à tous les clients.</w:t>
+      </w:r>
+    </w:p>
+    <w:p>
+      <w:r>
+        <w:rPr>
+          <w:b/>
+          <w:color w:val="D4A017"/>
+          <w:sz w:val="17"/>
+        </w:rPr>
+        <w:t xml:space="preserve">Utilise pour : </w:t>
+      </w:r>
+      <w:r>
+        <w:rPr>
+          <w:color w:val="555555"/>
+          <w:sz w:val="17"/>
+        </w:rPr>
+        <w:t>Chat temps réel, notifications live, collaboration, tableaux de bord</w:t>
+      </w:r>
+    </w:p>
+    <w:p>
+      <w:pPr>
+        <w:pBdr>
+          <w:bottom w:val="single" w:sz="4" w:space="4" w:color="EEEEEE"/>
+        </w:pBdr>
+      </w:pPr>
+    </w:p>
+    <w:p>
+      <w:r>
+        <w:rPr>
+          <w:b/>
+          <w:color w:val="D4A017"/>
+          <w:sz w:val="18"/>
+        </w:rPr>
+        <w:t xml:space="preserve">#14  </w:t>
+      </w:r>
+      <w:r>
+        <w:rPr>
+          <w:i/>
+          <w:color w:val="333333"/>
+          <w:sz w:val="19"/>
+        </w:rPr>
+        <w:t>"Crée un Worker R2 pour upload d'images : validation MIME, redimensionnement, génération de thumbnail, et URL signée."</w:t>
+      </w:r>
+    </w:p>
+    <w:p>
+      <w:r>
+        <w:rPr>
+          <w:b/>
+          <w:color w:val="D4A017"/>
+          <w:sz w:val="17"/>
+        </w:rPr>
+        <w:t xml:space="preserve">Explication : </w:t>
+      </w:r>
+      <w:r>
+        <w:rPr>
+          <w:color w:val="555555"/>
+          <w:sz w:val="17"/>
+        </w:rPr>
+        <w:t>API d'upload qui valide le MIME, redimensionne, crée une miniature, stocke dans R2, génère URL signée.</w:t>
+      </w:r>
+    </w:p>
+    <w:p>
+      <w:r>
+        <w:rPr>
+          <w:b/>
+          <w:color w:val="D4A017"/>
+          <w:sz w:val="17"/>
+        </w:rPr>
+        <w:t xml:space="preserve">Utilise pour : </w:t>
+      </w:r>
+      <w:r>
+        <w:rPr>
+          <w:color w:val="555555"/>
+          <w:sz w:val="17"/>
+        </w:rPr>
+        <w:t>Apps de partage d'images, galeries, profils, stockage sécurisé</w:t>
+      </w:r>
+    </w:p>
+    <w:p>
+      <w:pPr>
+        <w:pBdr>
+          <w:bottom w:val="single" w:sz="4" w:space="4" w:color="EEEEEE"/>
+        </w:pBdr>
+      </w:pPr>
+    </w:p>
+    <w:p>
+      <w:r>
+        <w:rPr>
+          <w:b/>
+          <w:color w:val="D4A017"/>
+          <w:sz w:val="18"/>
+        </w:rPr>
+        <w:t xml:space="preserve">#15  </w:t>
+      </w:r>
+      <w:r>
+        <w:rPr>
+          <w:i/>
+          <w:color w:val="333333"/>
+          <w:sz w:val="19"/>
+        </w:rPr>
+        <w:t>"Génère un Worker SaaS multitenant : authentification par clé API, quota par tenant, logs dans D1."</w:t>
+      </w:r>
+    </w:p>
+    <w:p>
+      <w:r>
+        <w:rPr>
+          <w:b/>
+          <w:color w:val="D4A017"/>
+          <w:sz w:val="17"/>
+        </w:rPr>
+        <w:t xml:space="preserve">Explication : </w:t>
+      </w:r>
+      <w:r>
+        <w:rPr>
+          <w:color w:val="555555"/>
+          <w:sz w:val="17"/>
+        </w:rPr>
+        <w:t>Architecture multi-tenant avec auth par clé API, compteur d'utilisation, logs dans D1.</w:t>
+      </w:r>
+    </w:p>
+    <w:p>
+      <w:r>
+        <w:rPr>
+          <w:b/>
+          <w:color w:val="D4A017"/>
+          <w:sz w:val="17"/>
+        </w:rPr>
+        <w:t xml:space="preserve">Utilise pour : </w:t>
+      </w:r>
+      <w:r>
+        <w:rPr>
+          <w:color w:val="555555"/>
+          <w:sz w:val="17"/>
+        </w:rPr>
+        <w:t>Plateforme SaaS, API publique avec abonnements</w:t>
+      </w:r>
+    </w:p>
+    <w:p>
+      <w:pPr>
+        <w:pBdr>
+          <w:bottom w:val="single" w:sz="4" w:space="4" w:color="EEEEEE"/>
+        </w:pBdr>
+      </w:pPr>
+    </w:p>
+    <w:p>
+      <w:r>
+        <w:rPr>
+          <w:b/>
+          <w:color w:val="D4A017"/>
+          <w:sz w:val="18"/>
+        </w:rPr>
+        <w:t xml:space="preserve">#16  </w:t>
+      </w:r>
+      <w:r>
+        <w:rPr>
+          <w:i/>
+          <w:color w:val="333333"/>
+          <w:sz w:val="19"/>
+        </w:rPr>
+        <w:t>"Worker de webhook : reçoit un payload, vérifie la signature, transforme les données, et les forward vers une queue."</w:t>
+      </w:r>
+    </w:p>
+    <w:p>
+      <w:r>
+        <w:rPr>
+          <w:b/>
+          <w:color w:val="D4A017"/>
+          <w:sz w:val="17"/>
+        </w:rPr>
+        <w:t xml:space="preserve">Explication : </w:t>
+      </w:r>
+      <w:r>
+        <w:rPr>
+          <w:color w:val="555555"/>
+          <w:sz w:val="17"/>
+        </w:rPr>
+        <w:t>Reçoit des webhooks, vérifie la signature HMAC, transforme les données, place dans une file d'attente.</w:t>
+      </w:r>
+    </w:p>
+    <w:p>
+      <w:r>
+        <w:rPr>
+          <w:b/>
+          <w:color w:val="D4A017"/>
+          <w:sz w:val="17"/>
+        </w:rPr>
+        <w:t xml:space="preserve">Utilise pour : </w:t>
+      </w:r>
+      <w:r>
+        <w:rPr>
+          <w:color w:val="555555"/>
+          <w:sz w:val="17"/>
+        </w:rPr>
+        <w:t>Intégrations Stripe, GitHub, Slack, webhooks fiables</w:t>
+      </w:r>
+    </w:p>
+    <w:p>
+      <w:pPr>
+        <w:pBdr>
+          <w:bottom w:val="single" w:sz="4" w:space="4" w:color="EEEEEE"/>
+        </w:pBdr>
+      </w:pPr>
+    </w:p>
+    <w:p>
+      <w:r>
+        <w:rPr>
+          <w:b/>
+          <w:color w:val="D4A017"/>
+          <w:sz w:val="18"/>
+        </w:rPr>
+        <w:t xml:space="preserve">#17  </w:t>
+      </w:r>
+      <w:r>
+        <w:rPr>
+          <w:i/>
+          <w:color w:val="333333"/>
+          <w:sz w:val="19"/>
+        </w:rPr>
+        <w:t>"Crée un modern proxy qui : route vers différents backends selon le path, rate limiting par IP, et cache en KV."</w:t>
+      </w:r>
+    </w:p>
+    <w:p>
+      <w:r>
+        <w:rPr>
+          <w:b/>
+          <w:color w:val="D4A017"/>
+          <w:sz w:val="17"/>
+        </w:rPr>
+        <w:t xml:space="preserve">Explication : </w:t>
+      </w:r>
+      <w:r>
+        <w:rPr>
+          <w:color w:val="555555"/>
+          <w:sz w:val="17"/>
+        </w:rPr>
+        <w:t>Proxy intelligent qui route vers différents serveurs selon l'URL, rate limiting par IP, cache KV.</w:t>
+      </w:r>
+    </w:p>
+    <w:p>
+      <w:r>
+        <w:rPr>
+          <w:b/>
+          <w:color w:val="D4A017"/>
+          <w:sz w:val="17"/>
+        </w:rPr>
+        <w:t xml:space="preserve">Utilise pour : </w:t>
+      </w:r>
+      <w:r>
+        <w:rPr>
+          <w:color w:val="555555"/>
+          <w:sz w:val="17"/>
+        </w:rPr>
+        <w:t>API Gateway, microservices routing, middleware sécurité</w:t>
+      </w:r>
+    </w:p>
+    <w:p>
+      <w:pPr>
+        <w:pBdr>
+          <w:bottom w:val="single" w:sz="4" w:space="4" w:color="EEEEEE"/>
+        </w:pBdr>
+      </w:pPr>
+    </w:p>
+    <w:p>
+      <w:r>
+        <w:rPr>
+          <w:b/>
+          <w:color w:val="D4A017"/>
+          <w:sz w:val="18"/>
+        </w:rPr>
+        <w:t xml:space="preserve">#18  </w:t>
+      </w:r>
+      <w:r>
+        <w:rPr>
+          <w:i/>
+          <w:color w:val="333333"/>
+          <w:sz w:val="19"/>
+        </w:rPr>
+        <w:t>"Worker avec AI binding : génère une image via FLUX, la stocke dans R2, et retourne une URL signée."</w:t>
+      </w:r>
+    </w:p>
+    <w:p>
+      <w:r>
+        <w:rPr>
+          <w:b/>
+          <w:color w:val="D4A017"/>
+          <w:sz w:val="17"/>
+        </w:rPr>
+        <w:t xml:space="preserve">Explication : </w:t>
+      </w:r>
+      <w:r>
+        <w:rPr>
+          <w:color w:val="555555"/>
+          <w:sz w:val="17"/>
+        </w:rPr>
+        <w:t>Utilise Workers AI pour générer une image via FLUX, stocke dans R2, retourne URL signée.</w:t>
+      </w:r>
+    </w:p>
+    <w:p>
+      <w:r>
+        <w:rPr>
+          <w:b/>
+          <w:color w:val="D4A017"/>
+          <w:sz w:val="17"/>
+        </w:rPr>
+        <w:t xml:space="preserve">Utilise pour : </w:t>
+      </w:r>
+      <w:r>
+        <w:rPr>
+          <w:color w:val="555555"/>
+          <w:sz w:val="17"/>
+        </w:rPr>
+        <w:t>Génération d'images à la demande, thumbnails auto</w:t>
+      </w:r>
+    </w:p>
+    <w:p>
+      <w:pPr>
+        <w:pBdr>
+          <w:bottom w:val="single" w:sz="4" w:space="4" w:color="EEEEEE"/>
+        </w:pBdr>
+      </w:pPr>
+    </w:p>
+    <w:p>
+      <w:r>
+        <w:rPr>
+          <w:b/>
+          <w:color w:val="D4A017"/>
+          <w:sz w:val="18"/>
+        </w:rPr>
+        <w:t xml:space="preserve">#19  </w:t>
+      </w:r>
+      <w:r>
+        <w:rPr>
+          <w:i/>
+          <w:color w:val="333333"/>
+          <w:sz w:val="19"/>
+        </w:rPr>
+        <w:t>"Worker Email : reçoit un email via MailChannels, le parse, stocke dans D1, et répond automatiquement."</w:t>
+      </w:r>
+    </w:p>
+    <w:p>
+      <w:r>
+        <w:rPr>
+          <w:b/>
+          <w:color w:val="D4A017"/>
+          <w:sz w:val="17"/>
+        </w:rPr>
+        <w:t xml:space="preserve">Explication : </w:t>
+      </w:r>
+      <w:r>
+        <w:rPr>
+          <w:color w:val="555555"/>
+          <w:sz w:val="17"/>
+        </w:rPr>
+        <w:t>Réception d'emails via MailChannels, extraction, sauvegarde D1, réponse automatique.</w:t>
+      </w:r>
+    </w:p>
+    <w:p>
+      <w:r>
+        <w:rPr>
+          <w:b/>
+          <w:color w:val="D4A017"/>
+          <w:sz w:val="17"/>
+        </w:rPr>
+        <w:t xml:space="preserve">Utilise pour : </w:t>
+      </w:r>
+      <w:r>
+        <w:rPr>
+          <w:color w:val="555555"/>
+          <w:sz w:val="17"/>
+        </w:rPr>
+        <w:t>Support ticket, collecte emails, formulaires contact</w:t>
+      </w:r>
+    </w:p>
+    <w:p>
+      <w:pPr>
+        <w:pBdr>
+          <w:bottom w:val="single" w:sz="4" w:space="4" w:color="EEEEEE"/>
+        </w:pBdr>
+      </w:pPr>
+    </w:p>
+    <w:p>
+      <w:r>
+        <w:rPr>
+          <w:b/>
+          <w:color w:val="D4A017"/>
+          <w:sz w:val="18"/>
+        </w:rPr>
+        <w:t xml:space="preserve">#20  </w:t>
+      </w:r>
+      <w:r>
+        <w:rPr>
+          <w:i/>
+          <w:color w:val="333333"/>
+          <w:sz w:val="19"/>
+        </w:rPr>
+        <w:t>"Génère un Worker API REST avec : routes CRUD, middleware auth, pagination cursor-based, et documentation OpenAPI."</w:t>
+      </w:r>
+    </w:p>
+    <w:p>
+      <w:r>
+        <w:rPr>
+          <w:b/>
+          <w:color w:val="D4A017"/>
+          <w:sz w:val="17"/>
+        </w:rPr>
+        <w:t xml:space="preserve">Explication : </w:t>
+      </w:r>
+      <w:r>
+        <w:rPr>
+          <w:color w:val="555555"/>
+          <w:sz w:val="17"/>
+        </w:rPr>
+        <w:t>API REST complète : CRUD, middleware auth, pagination curseur, documentation OpenAPI.</w:t>
+      </w:r>
+    </w:p>
+    <w:p>
+      <w:r>
+        <w:rPr>
+          <w:b/>
+          <w:color w:val="D4A017"/>
+          <w:sz w:val="17"/>
+        </w:rPr>
+        <w:t xml:space="preserve">Utilise pour : </w:t>
+      </w:r>
+      <w:r>
+        <w:rPr>
+          <w:color w:val="555555"/>
+          <w:sz w:val="17"/>
+        </w:rPr>
+        <w:t>Backend SPA/mobile, API publique, microservice documenté</w:t>
+      </w:r>
+    </w:p>
+    <w:p>
+      <w:pPr>
+        <w:pBdr>
+          <w:bottom w:val="single" w:sz="4" w:space="4" w:color="EEEEEE"/>
+        </w:pBdr>
+      </w:pPr>
+    </w:p>
+    <w:p>
+      <w:r>
+        <w:rPr>
+          <w:b/>
+          <w:color w:val="D4A017"/>
+          <w:sz w:val="18"/>
+        </w:rPr>
+        <w:t xml:space="preserve">#21  </w:t>
+      </w:r>
+      <w:r>
+        <w:rPr>
+          <w:i/>
+          <w:color w:val="333333"/>
+          <w:sz w:val="19"/>
+        </w:rPr>
+        <w:t>"Crée une API Express/Node.js avec : authentification JWT, refresh tokens, rate limiting, et validation des entrées."</w:t>
+      </w:r>
+    </w:p>
+    <w:p>
+      <w:r>
+        <w:rPr>
+          <w:b/>
+          <w:color w:val="D4A017"/>
+          <w:sz w:val="17"/>
+        </w:rPr>
+        <w:t xml:space="preserve">Explication : </w:t>
+      </w:r>
+      <w:r>
+        <w:rPr>
+          <w:color w:val="555555"/>
+          <w:sz w:val="17"/>
+        </w:rPr>
+        <w:t>API sécurisée : JWT courte durée + refresh tokens, rate limiting, validation entrées.</w:t>
+      </w:r>
+    </w:p>
+    <w:p>
+      <w:r>
+        <w:rPr>
+          <w:b/>
+          <w:color w:val="D4A017"/>
+          <w:sz w:val="17"/>
+        </w:rPr>
+        <w:t xml:space="preserve">Utilise pour : </w:t>
+      </w:r>
+      <w:r>
+        <w:rPr>
+          <w:color w:val="555555"/>
+          <w:sz w:val="17"/>
+        </w:rPr>
+        <w:t>Backend web/mobile, API sécurisée, SaaS avec auth</w:t>
+      </w:r>
+    </w:p>
+    <w:p>
+      <w:pPr>
+        <w:pBdr>
+          <w:bottom w:val="single" w:sz="4" w:space="4" w:color="EEEEEE"/>
+        </w:pBdr>
+      </w:pPr>
+    </w:p>
+    <w:p>
+      <w:r>
+        <w:rPr>
+          <w:b/>
+          <w:color w:val="D4A017"/>
+          <w:sz w:val="18"/>
+        </w:rPr>
+        <w:t xml:space="preserve">#22  </w:t>
+      </w:r>
+      <w:r>
+        <w:rPr>
+          <w:i/>
+          <w:color w:val="333333"/>
+          <w:sz w:val="19"/>
+        </w:rPr>
+        <w:t>"Génère un endpoint qui agrège des données de 3 APIs externes, les merge, et les retourne avec mise en cache."</w:t>
+      </w:r>
+    </w:p>
+    <w:p>
+      <w:r>
+        <w:rPr>
+          <w:b/>
+          <w:color w:val="D4A017"/>
+          <w:sz w:val="17"/>
+        </w:rPr>
+        <w:t xml:space="preserve">Explication : </w:t>
+      </w:r>
+      <w:r>
+        <w:rPr>
+          <w:color w:val="555555"/>
+          <w:sz w:val="17"/>
+        </w:rPr>
+        <w:t>Appelle plusieurs APIs en parallèle, fusionne les résultats, met en cache la réponse agrégée.</w:t>
+      </w:r>
+    </w:p>
+    <w:p>
+      <w:r>
+        <w:rPr>
+          <w:b/>
+          <w:color w:val="D4A017"/>
+          <w:sz w:val="17"/>
+        </w:rPr>
+        <w:t xml:space="preserve">Utilise pour : </w:t>
+      </w:r>
+      <w:r>
+        <w:rPr>
+          <w:color w:val="555555"/>
+          <w:sz w:val="17"/>
+        </w:rPr>
+        <w:t>Dashboards multi-sources, apps météo/finance</w:t>
+      </w:r>
+    </w:p>
+    <w:p>
+      <w:pPr>
+        <w:pBdr>
+          <w:bottom w:val="single" w:sz="4" w:space="4" w:color="EEEEEE"/>
+        </w:pBdr>
+      </w:pPr>
+    </w:p>
+    <w:p>
+      <w:r>
+        <w:rPr>
+          <w:b/>
+          <w:color w:val="D4A017"/>
+          <w:sz w:val="18"/>
+        </w:rPr>
+        <w:t xml:space="preserve">#23  </w:t>
+      </w:r>
+      <w:r>
+        <w:rPr>
+          <w:i/>
+          <w:color w:val="333333"/>
+          <w:sz w:val="19"/>
+        </w:rPr>
+        <w:t>"API de recherche full-text avec : Fuse.js côté serveur, filtres multiples, tri par pertinence, et suggestions."</w:t>
+      </w:r>
+    </w:p>
+    <w:p>
+      <w:r>
+        <w:rPr>
+          <w:b/>
+          <w:color w:val="D4A017"/>
+          <w:sz w:val="17"/>
+        </w:rPr>
+        <w:t xml:space="preserve">Explication : </w:t>
+      </w:r>
+      <w:r>
+        <w:rPr>
+          <w:color w:val="555555"/>
+          <w:sz w:val="17"/>
+        </w:rPr>
+        <w:t>Moteur de recherche fuzzy (tolère les fautes), filtres, tri par pertinence, suggestions.</w:t>
+      </w:r>
+    </w:p>
+    <w:p>
+      <w:r>
+        <w:rPr>
+          <w:b/>
+          <w:color w:val="D4A017"/>
+          <w:sz w:val="17"/>
+        </w:rPr>
+        <w:t xml:space="preserve">Utilise pour : </w:t>
+      </w:r>
+      <w:r>
+        <w:rPr>
+          <w:color w:val="555555"/>
+          <w:sz w:val="17"/>
+        </w:rPr>
+        <w:t>Recherche interne, catalogue produits, documentation</w:t>
+      </w:r>
+    </w:p>
+    <w:p>
+      <w:pPr>
+        <w:pBdr>
+          <w:bottom w:val="single" w:sz="4" w:space="4" w:color="EEEEEE"/>
+        </w:pBdr>
+      </w:pPr>
+    </w:p>
+    <w:p>
+      <w:r>
+        <w:rPr>
+          <w:b/>
+          <w:color w:val="D4A017"/>
+          <w:sz w:val="18"/>
+        </w:rPr>
+        <w:t xml:space="preserve">#24  </w:t>
+      </w:r>
+      <w:r>
+        <w:rPr>
+          <w:i/>
+          <w:color w:val="333333"/>
+          <w:sz w:val="19"/>
+        </w:rPr>
+        <w:t>"Crée un système de webhook sortant : enregistre les événements, les envoie avec retry exponentiel, et log les échecs."</w:t>
+      </w:r>
+    </w:p>
+    <w:p>
+      <w:r>
+        <w:rPr>
+          <w:b/>
+          <w:color w:val="D4A017"/>
+          <w:sz w:val="17"/>
+        </w:rPr>
+        <w:t xml:space="preserve">Explication : </w:t>
+      </w:r>
+      <w:r>
+        <w:rPr>
+          <w:color w:val="555555"/>
+          <w:sz w:val="17"/>
+        </w:rPr>
+        <w:t>Notifie des services externes sur événement, retry exponentiel, journalisation des échecs.</w:t>
+      </w:r>
+    </w:p>
+    <w:p>
+      <w:r>
+        <w:rPr>
+          <w:b/>
+          <w:color w:val="D4A017"/>
+          <w:sz w:val="17"/>
+        </w:rPr>
+        <w:t xml:space="preserve">Utilise pour : </w:t>
+      </w:r>
+      <w:r>
+        <w:rPr>
+          <w:color w:val="555555"/>
+          <w:sz w:val="17"/>
+        </w:rPr>
+        <w:t>Intégrations tierces, notifications Slack/Discord</w:t>
+      </w:r>
+    </w:p>
+    <w:p>
+      <w:pPr>
+        <w:pBdr>
+          <w:bottom w:val="single" w:sz="4" w:space="4" w:color="EEEEEE"/>
+        </w:pBdr>
+      </w:pPr>
+    </w:p>
+    <w:p>
+      <w:r>
+        <w:rPr>
+          <w:b/>
+          <w:color w:val="D4A017"/>
+          <w:sz w:val="18"/>
+        </w:rPr>
+        <w:t xml:space="preserve">#25  </w:t>
+      </w:r>
+      <w:r>
+        <w:rPr>
+          <w:i/>
+          <w:color w:val="333333"/>
+          <w:sz w:val="19"/>
+        </w:rPr>
+        <w:t>"Génère un endpoint de génération de PDF via Puppeteer avec : template HTML, header/footer personnalisé."</w:t>
+      </w:r>
+    </w:p>
+    <w:p>
+      <w:r>
+        <w:rPr>
+          <w:b/>
+          <w:color w:val="D4A017"/>
+          <w:sz w:val="17"/>
+        </w:rPr>
+        <w:t xml:space="preserve">Explication : </w:t>
+      </w:r>
+      <w:r>
+        <w:rPr>
+          <w:color w:val="555555"/>
+          <w:sz w:val="17"/>
+        </w:rPr>
+        <w:t>Convertit un template HTML en PDF via Puppeteer, avec en-tête/pied de page personnalisés.</w:t>
+      </w:r>
+    </w:p>
+    <w:p>
+      <w:r>
+        <w:rPr>
+          <w:b/>
+          <w:color w:val="D4A017"/>
+          <w:sz w:val="17"/>
+        </w:rPr>
+        <w:t xml:space="preserve">Utilise pour : </w:t>
+      </w:r>
+      <w:r>
+        <w:rPr>
+          <w:color w:val="555555"/>
+          <w:sz w:val="17"/>
+        </w:rPr>
+        <w:t>Factures, rapports PDF, certificats, tickets</w:t>
+      </w:r>
+    </w:p>
+    <w:p>
+      <w:pPr>
+        <w:pBdr>
+          <w:bottom w:val="single" w:sz="4" w:space="4" w:color="EEEEEE"/>
+        </w:pBdr>
+      </w:pPr>
+    </w:p>
+    <w:p>
+      <w:r>
+        <w:rPr>
+          <w:b/>
+          <w:color w:val="D4A017"/>
+          <w:sz w:val="18"/>
+        </w:rPr>
+        <w:t xml:space="preserve">#26  </w:t>
+      </w:r>
+      <w:r>
+        <w:rPr>
+          <w:i/>
+          <w:color w:val="333333"/>
+          <w:sz w:val="19"/>
+        </w:rPr>
+        <w:t>"API d'upload avec : validation, compression, stockage cloud, génération d'URL, et nettoyage automatique."</w:t>
+      </w:r>
+    </w:p>
+    <w:p>
+      <w:r>
+        <w:rPr>
+          <w:b/>
+          <w:color w:val="D4A017"/>
+          <w:sz w:val="17"/>
+        </w:rPr>
+        <w:t xml:space="preserve">Explication : </w:t>
+      </w:r>
+      <w:r>
+        <w:rPr>
+          <w:color w:val="555555"/>
+          <w:sz w:val="17"/>
+        </w:rPr>
+        <w:t>Upload complet : validation, compression, stockage cloud, URL temporaire, nettoyage auto.</w:t>
+      </w:r>
+    </w:p>
+    <w:p>
+      <w:r>
+        <w:rPr>
+          <w:b/>
+          <w:color w:val="D4A017"/>
+          <w:sz w:val="17"/>
+        </w:rPr>
+        <w:t xml:space="preserve">Utilise pour : </w:t>
+      </w:r>
+      <w:r>
+        <w:rPr>
+          <w:color w:val="555555"/>
+          <w:sz w:val="17"/>
+        </w:rPr>
+        <w:t>Partage fichiers, upload images/vidéos, transfert sécurisé</w:t>
+      </w:r>
+    </w:p>
+    <w:p>
+      <w:pPr>
+        <w:pBdr>
+          <w:bottom w:val="single" w:sz="4" w:space="4" w:color="EEEEEE"/>
+        </w:pBdr>
+      </w:pPr>
+    </w:p>
+    <w:p>
+      <w:r>
+        <w:rPr>
+          <w:b/>
+          <w:color w:val="D4A017"/>
+          <w:sz w:val="18"/>
+        </w:rPr>
+        <w:t xml:space="preserve">#27  </w:t>
+      </w:r>
+      <w:r>
+        <w:rPr>
+          <w:i/>
+          <w:color w:val="333333"/>
+          <w:sz w:val="19"/>
+        </w:rPr>
+        <w:t>"Crée un système de cache Redis-like en memory pour Node.js avec TTL, max size, et stats d'utilisation."</w:t>
+      </w:r>
+    </w:p>
+    <w:p>
+      <w:r>
+        <w:rPr>
+          <w:b/>
+          <w:color w:val="D4A017"/>
+          <w:sz w:val="17"/>
+        </w:rPr>
+        <w:t xml:space="preserve">Explication : </w:t>
+      </w:r>
+      <w:r>
+        <w:rPr>
+          <w:color w:val="555555"/>
+          <w:sz w:val="17"/>
+        </w:rPr>
+        <w:t>Cache mémoire avec TTL, taille max, éviction LRU, stats d'utilisation.</w:t>
+      </w:r>
+    </w:p>
+    <w:p>
+      <w:r>
+        <w:rPr>
+          <w:b/>
+          <w:color w:val="D4A017"/>
+          <w:sz w:val="17"/>
+        </w:rPr>
+        <w:t xml:space="preserve">Utilise pour : </w:t>
+      </w:r>
+      <w:r>
+        <w:rPr>
+          <w:color w:val="555555"/>
+          <w:sz w:val="17"/>
+        </w:rPr>
+        <w:t>Optimisation performances, réduction appels API</w:t>
+      </w:r>
+    </w:p>
+    <w:p>
+      <w:pPr>
+        <w:pBdr>
+          <w:bottom w:val="single" w:sz="4" w:space="4" w:color="EEEEEE"/>
+        </w:pBdr>
+      </w:pPr>
+    </w:p>
+    <w:p>
+      <w:r>
+        <w:rPr>
+          <w:b/>
+          <w:color w:val="D4A017"/>
+          <w:sz w:val="18"/>
+        </w:rPr>
+        <w:t xml:space="preserve">#28  </w:t>
+      </w:r>
+      <w:r>
+        <w:rPr>
+          <w:i/>
+          <w:color w:val="333333"/>
+          <w:sz w:val="19"/>
+        </w:rPr>
+        <w:t>"Génère un middleware de logging structuré : request ID, timing, body partiel, et rotation des logs."</w:t>
+      </w:r>
+    </w:p>
+    <w:p>
+      <w:r>
+        <w:rPr>
+          <w:b/>
+          <w:color w:val="D4A017"/>
+          <w:sz w:val="17"/>
+        </w:rPr>
+        <w:t xml:space="preserve">Explication : </w:t>
+      </w:r>
+      <w:r>
+        <w:rPr>
+          <w:color w:val="555555"/>
+          <w:sz w:val="17"/>
+        </w:rPr>
+        <w:t>Middleware Express : ID unique par requête, timing, body tronqué, rotation logs.</w:t>
+      </w:r>
+    </w:p>
+    <w:p>
+      <w:r>
+        <w:rPr>
+          <w:b/>
+          <w:color w:val="D4A017"/>
+          <w:sz w:val="17"/>
+        </w:rPr>
+        <w:t xml:space="preserve">Utilise pour : </w:t>
+      </w:r>
+      <w:r>
+        <w:rPr>
+          <w:color w:val="555555"/>
+          <w:sz w:val="17"/>
+        </w:rPr>
+        <w:t>Débogage production, monitoring, audit, traçage</w:t>
+      </w:r>
+    </w:p>
+    <w:p>
+      <w:pPr>
+        <w:pBdr>
+          <w:bottom w:val="single" w:sz="4" w:space="4" w:color="EEEEEE"/>
+        </w:pBdr>
+      </w:pPr>
+    </w:p>
+    <w:p>
+      <w:r>
+        <w:rPr>
+          <w:b/>
+          <w:color w:val="D4A017"/>
+          <w:sz w:val="18"/>
+        </w:rPr>
+        <w:t xml:space="preserve">#29  </w:t>
+      </w:r>
+      <w:r>
+        <w:rPr>
+          <w:i/>
+          <w:color w:val="333333"/>
+          <w:sz w:val="19"/>
+        </w:rPr>
+        <w:t>"API de notifications multi-canal : email, push, SMS avec template engine et file d'attente priorisée."</w:t>
+      </w:r>
+    </w:p>
+    <w:p>
+      <w:r>
+        <w:rPr>
+          <w:b/>
+          <w:color w:val="D4A017"/>
+          <w:sz w:val="17"/>
+        </w:rPr>
+        <w:t xml:space="preserve">Explication : </w:t>
+      </w:r>
+      <w:r>
+        <w:rPr>
+          <w:color w:val="555555"/>
+          <w:sz w:val="17"/>
+        </w:rPr>
+        <w:t>Notifications multi-canal : email/push/SMS, templates, file d'attente priorisée.</w:t>
+      </w:r>
+    </w:p>
+    <w:p>
+      <w:r>
+        <w:rPr>
+          <w:b/>
+          <w:color w:val="D4A017"/>
+          <w:sz w:val="17"/>
+        </w:rPr>
+        <w:t xml:space="preserve">Utilise pour : </w:t>
+      </w:r>
+      <w:r>
+        <w:rPr>
+          <w:color w:val="555555"/>
+          <w:sz w:val="17"/>
+        </w:rPr>
+        <w:t>Notifications app, alertes sécurité, confirmation commande</w:t>
+      </w:r>
+    </w:p>
+    <w:p>
+      <w:pPr>
+        <w:pBdr>
+          <w:bottom w:val="single" w:sz="4" w:space="4" w:color="EEEEEE"/>
+        </w:pBdr>
+      </w:pPr>
+    </w:p>
+    <w:p>
+      <w:r>
+        <w:rPr>
+          <w:b/>
+          <w:color w:val="D4A017"/>
+          <w:sz w:val="18"/>
+        </w:rPr>
+        <w:t xml:space="preserve">#30  </w:t>
+      </w:r>
+      <w:r>
+        <w:rPr>
+          <w:i/>
+          <w:color w:val="333333"/>
+          <w:sz w:val="19"/>
+        </w:rPr>
+        <w:t>"Crée un système de feature flags avec : stockage distant, cache local, segmentation par user, et interface admin."</w:t>
+      </w:r>
+    </w:p>
+    <w:p>
+      <w:r>
+        <w:rPr>
+          <w:b/>
+          <w:color w:val="D4A017"/>
+          <w:sz w:val="17"/>
+        </w:rPr>
+        <w:t xml:space="preserve">Explication : </w:t>
+      </w:r>
+      <w:r>
+        <w:rPr>
+          <w:color w:val="555555"/>
+          <w:sz w:val="17"/>
+        </w:rPr>
+        <w:t>Feature flags activables à distance, cache local, segmentation par user, panneau admin.</w:t>
+      </w:r>
+    </w:p>
+    <w:p>
+      <w:r>
+        <w:rPr>
+          <w:b/>
+          <w:color w:val="D4A017"/>
+          <w:sz w:val="17"/>
+        </w:rPr>
+        <w:t xml:space="preserve">Utilise pour : </w:t>
+      </w:r>
+      <w:r>
+        <w:rPr>
+          <w:color w:val="555555"/>
+          <w:sz w:val="17"/>
+        </w:rPr>
+        <w:t>Déploiement progressif, tests A/B, rollback rapide</w:t>
+      </w:r>
+    </w:p>
+    <w:p>
+      <w:pPr>
+        <w:pBdr>
+          <w:bottom w:val="single" w:sz="4" w:space="4" w:color="EEEEEE"/>
+        </w:pBdr>
+      </w:pPr>
+    </w:p>
+    <w:p>
+      <w:r>
+        <w:br w:type="page"/>
+      </w:r>
+    </w:p>
+    <w:p>
+      <w:r>
+        <w:rPr>
+          <w:b/>
+          <w:color w:val="D4A017"/>
+          <w:sz w:val="28"/>
+        </w:rPr>
+        <w:t>Prompts Marketing &amp; Blog (30 prompts)</w:t>
+      </w:r>
+    </w:p>
+    <w:p>
+      <w:r>
+        <w:rPr>
+          <w:b/>
+          <w:color w:val="D4A017"/>
+          <w:sz w:val="18"/>
+        </w:rPr>
+        <w:t xml:space="preserve">#56  </w:t>
+      </w:r>
+      <w:r>
+        <w:rPr>
+          <w:i/>
+          <w:color w:val="333333"/>
+          <w:sz w:val="19"/>
+        </w:rPr>
+        <w:t>"Écris un article de blog de 1500 mots sur [sujet]. Structure : accroche, problème, solution, exemples, conclusion avec CTA."</w:t>
+      </w:r>
+    </w:p>
+    <w:p>
+      <w:r>
+        <w:rPr>
+          <w:b/>
+          <w:color w:val="D4A017"/>
+          <w:sz w:val="17"/>
+        </w:rPr>
+        <w:t xml:space="preserve">Explication : </w:t>
+      </w:r>
+      <w:r>
+        <w:rPr>
+          <w:color w:val="555555"/>
+          <w:sz w:val="17"/>
+        </w:rPr>
+        <w:t>Article long-format structuré : accroche, problème, solution, exemples, CTA.</w:t>
+      </w:r>
+    </w:p>
+    <w:p>
+      <w:r>
+        <w:rPr>
+          <w:b/>
+          <w:color w:val="D4A017"/>
+          <w:sz w:val="17"/>
+        </w:rPr>
+        <w:t xml:space="preserve">Utilise pour : </w:t>
+      </w:r>
+      <w:r>
+        <w:rPr>
+          <w:color w:val="555555"/>
+          <w:sz w:val="17"/>
+        </w:rPr>
+        <w:t>Blog SEO, content marketing, lead gen</w:t>
+      </w:r>
+    </w:p>
+    <w:p>
+      <w:pPr>
+        <w:pBdr>
+          <w:bottom w:val="single" w:sz="4" w:space="4" w:color="EEEEEE"/>
+        </w:pBdr>
+      </w:pPr>
+    </w:p>
+    <w:p>
+      <w:r>
+        <w:rPr>
+          <w:b/>
+          <w:color w:val="D4A017"/>
+          <w:sz w:val="18"/>
+        </w:rPr>
+        <w:t xml:space="preserve">#57  </w:t>
+      </w:r>
+      <w:r>
+        <w:rPr>
+          <w:i/>
+          <w:color w:val="333333"/>
+          <w:sz w:val="19"/>
+        </w:rPr>
+        <w:t>"Transforme cet article technique [texte] en 5 posts LinkedIn. Chaque post doit avoir un hook fort."</w:t>
+      </w:r>
+    </w:p>
+    <w:p>
+      <w:r>
+        <w:rPr>
+          <w:b/>
+          <w:color w:val="D4A017"/>
+          <w:sz w:val="17"/>
+        </w:rPr>
+        <w:t xml:space="preserve">Explication : </w:t>
+      </w:r>
+      <w:r>
+        <w:rPr>
+          <w:color w:val="555555"/>
+          <w:sz w:val="17"/>
+        </w:rPr>
+        <w:t>Transforme un contenu technique en 5 posts LinkedIn percutants avec hook.</w:t>
+      </w:r>
+    </w:p>
+    <w:p>
+      <w:r>
+        <w:rPr>
+          <w:b/>
+          <w:color w:val="D4A017"/>
+          <w:sz w:val="17"/>
+        </w:rPr>
+        <w:t xml:space="preserve">Utilise pour : </w:t>
+      </w:r>
+      <w:r>
+        <w:rPr>
+          <w:color w:val="555555"/>
+          <w:sz w:val="17"/>
+        </w:rPr>
+        <w:t>LinkedIn, personal branding, recyclage</w:t>
+      </w:r>
+    </w:p>
+    <w:p>
+      <w:pPr>
+        <w:pBdr>
+          <w:bottom w:val="single" w:sz="4" w:space="4" w:color="EEEEEE"/>
+        </w:pBdr>
+      </w:pPr>
+    </w:p>
+    <w:p>
+      <w:r>
+        <w:rPr>
+          <w:b/>
+          <w:color w:val="D4A017"/>
+          <w:sz w:val="18"/>
+        </w:rPr>
+        <w:t xml:space="preserve">#58  </w:t>
+      </w:r>
+      <w:r>
+        <w:rPr>
+          <w:i/>
+          <w:color w:val="333333"/>
+          <w:sz w:val="19"/>
+        </w:rPr>
+        <w:t>"Génère 20 variantes de titres pour mon article '[titre]'. Mix de formats : listicle, how-to, question, controversé."</w:t>
+      </w:r>
+    </w:p>
+    <w:p>
+      <w:r>
+        <w:rPr>
+          <w:b/>
+          <w:color w:val="D4A017"/>
+          <w:sz w:val="17"/>
+        </w:rPr>
+        <w:t xml:space="preserve">Explication : </w:t>
+      </w:r>
+      <w:r>
+        <w:rPr>
+          <w:color w:val="555555"/>
+          <w:sz w:val="17"/>
+        </w:rPr>
+        <w:t>20 variantes de titres testant différents angles : listicle, how-to, question, controversé.</w:t>
+      </w:r>
+    </w:p>
+    <w:p>
+      <w:r>
+        <w:rPr>
+          <w:b/>
+          <w:color w:val="D4A017"/>
+          <w:sz w:val="17"/>
+        </w:rPr>
+        <w:t xml:space="preserve">Utilise pour : </w:t>
+      </w:r>
+      <w:r>
+        <w:rPr>
+          <w:color w:val="555555"/>
+          <w:sz w:val="17"/>
+        </w:rPr>
+        <w:t>Optimisation clics, tests A/B SEO</w:t>
+      </w:r>
+    </w:p>
+    <w:p>
+      <w:pPr>
+        <w:pBdr>
+          <w:bottom w:val="single" w:sz="4" w:space="4" w:color="EEEEEE"/>
+        </w:pBdr>
+      </w:pPr>
+    </w:p>
+    <w:p>
+      <w:r>
+        <w:rPr>
+          <w:b/>
+          <w:color w:val="D4A017"/>
+          <w:sz w:val="18"/>
+        </w:rPr>
+        <w:t xml:space="preserve">#59  </w:t>
+      </w:r>
+      <w:r>
+        <w:rPr>
+          <w:i/>
+          <w:color w:val="333333"/>
+          <w:sz w:val="19"/>
+        </w:rPr>
+        <w:t>"Écris une meta description SEO pour [article] de max 160 chars avec le mot-clé [mot] placé naturellement."</w:t>
+      </w:r>
+    </w:p>
+    <w:p>
+      <w:r>
+        <w:rPr>
+          <w:b/>
+          <w:color w:val="D4A017"/>
+          <w:sz w:val="17"/>
+        </w:rPr>
+        <w:t xml:space="preserve">Explication : </w:t>
+      </w:r>
+      <w:r>
+        <w:rPr>
+          <w:color w:val="555555"/>
+          <w:sz w:val="17"/>
+        </w:rPr>
+        <w:t>Meta description SEO optimisée : 160 chars, mot-clé naturel, accroche clic.</w:t>
+      </w:r>
+    </w:p>
+    <w:p>
+      <w:r>
+        <w:rPr>
+          <w:b/>
+          <w:color w:val="D4A017"/>
+          <w:sz w:val="17"/>
+        </w:rPr>
+        <w:t xml:space="preserve">Utilise pour : </w:t>
+      </w:r>
+      <w:r>
+        <w:rPr>
+          <w:color w:val="555555"/>
+          <w:sz w:val="17"/>
+        </w:rPr>
+        <w:t>SEO on-page, taux de clic Google</w:t>
+      </w:r>
+    </w:p>
+    <w:p>
+      <w:pPr>
+        <w:pBdr>
+          <w:bottom w:val="single" w:sz="4" w:space="4" w:color="EEEEEE"/>
+        </w:pBdr>
+      </w:pPr>
+    </w:p>
+    <w:p>
+      <w:r>
+        <w:rPr>
+          <w:b/>
+          <w:color w:val="D4A017"/>
+          <w:sz w:val="18"/>
+        </w:rPr>
+        <w:t xml:space="preserve">#60  </w:t>
+      </w:r>
+      <w:r>
+        <w:rPr>
+          <w:i/>
+          <w:color w:val="333333"/>
+          <w:sz w:val="19"/>
+        </w:rPr>
+        <w:t>"Crée une newsletter de 300 mots pour annoncer [feature/nouveauté]. Ton : conversationnel, exclusif, avec CTA."</w:t>
+      </w:r>
+    </w:p>
+    <w:p>
+      <w:r>
+        <w:rPr>
+          <w:b/>
+          <w:color w:val="D4A017"/>
+          <w:sz w:val="17"/>
+        </w:rPr>
+        <w:t xml:space="preserve">Explication : </w:t>
+      </w:r>
+      <w:r>
+        <w:rPr>
+          <w:color w:val="555555"/>
+          <w:sz w:val="17"/>
+        </w:rPr>
+        <w:t>Newsletter courte et impactante, ton personnel et exclusif, CTA clair.</w:t>
+      </w:r>
+    </w:p>
+    <w:p>
+      <w:r>
+        <w:rPr>
+          <w:b/>
+          <w:color w:val="D4A017"/>
+          <w:sz w:val="17"/>
+        </w:rPr>
+        <w:t xml:space="preserve">Utilise pour : </w:t>
+      </w:r>
+      <w:r>
+        <w:rPr>
+          <w:color w:val="555555"/>
+          <w:sz w:val="17"/>
+        </w:rPr>
+        <w:t>Newsletter produit, annonces, communauté</w:t>
+      </w:r>
+    </w:p>
+    <w:p>
+      <w:pPr>
+        <w:pBdr>
+          <w:bottom w:val="single" w:sz="4" w:space="4" w:color="EEEEEE"/>
+        </w:pBdr>
+      </w:pPr>
+    </w:p>
+    <w:p>
+      <w:r>
+        <w:rPr>
+          <w:b/>
+          <w:color w:val="D4A017"/>
+          <w:sz w:val="18"/>
+        </w:rPr>
+        <w:t xml:space="preserve">#61  </w:t>
+      </w:r>
+      <w:r>
+        <w:rPr>
+          <w:i/>
+          <w:color w:val="333333"/>
+          <w:sz w:val="19"/>
+        </w:rPr>
+        <w:t>"Génère 10 idées de contenu viral sur TikTok/Reels pour [niche]. Chaque idée : hook, format, durée estimée."</w:t>
+      </w:r>
+    </w:p>
+    <w:p>
+      <w:r>
+        <w:rPr>
+          <w:b/>
+          <w:color w:val="D4A017"/>
+          <w:sz w:val="17"/>
+        </w:rPr>
+        <w:t xml:space="preserve">Explication : </w:t>
+      </w:r>
+      <w:r>
+        <w:rPr>
+          <w:color w:val="555555"/>
+          <w:sz w:val="17"/>
+        </w:rPr>
+        <w:t>10 concepts de vidéos courtes avec accroche, format, durée pour rétention max.</w:t>
+      </w:r>
+    </w:p>
+    <w:p>
+      <w:r>
+        <w:rPr>
+          <w:b/>
+          <w:color w:val="D4A017"/>
+          <w:sz w:val="17"/>
+        </w:rPr>
+        <w:t xml:space="preserve">Utilise pour : </w:t>
+      </w:r>
+      <w:r>
+        <w:rPr>
+          <w:color w:val="555555"/>
+          <w:sz w:val="17"/>
+        </w:rPr>
+        <w:t>TikTok, Reels, Shorts, contenu viral</w:t>
+      </w:r>
+    </w:p>
+    <w:p>
+      <w:pPr>
+        <w:pBdr>
+          <w:bottom w:val="single" w:sz="4" w:space="4" w:color="EEEEEE"/>
+        </w:pBdr>
+      </w:pPr>
+    </w:p>
+    <w:p>
+      <w:r>
+        <w:rPr>
+          <w:b/>
+          <w:color w:val="D4A017"/>
+          <w:sz w:val="18"/>
+        </w:rPr>
+        <w:t xml:space="preserve">#62  </w:t>
+      </w:r>
+      <w:r>
+        <w:rPr>
+          <w:i/>
+          <w:color w:val="333333"/>
+          <w:sz w:val="19"/>
+        </w:rPr>
+        <w:t>"Rédige un thread Twitter/X de 10 tweets sur [sujet]. Premier tweet doit être une accroche imparable."</w:t>
+      </w:r>
+    </w:p>
+    <w:p>
+      <w:r>
+        <w:rPr>
+          <w:b/>
+          <w:color w:val="D4A017"/>
+          <w:sz w:val="17"/>
+        </w:rPr>
+        <w:t xml:space="preserve">Explication : </w:t>
+      </w:r>
+      <w:r>
+        <w:rPr>
+          <w:color w:val="555555"/>
+          <w:sz w:val="17"/>
+        </w:rPr>
+        <w:t>Fil de 10 tweets avec accroche imparable, contenu au milieu, conclusion.</w:t>
+      </w:r>
+    </w:p>
+    <w:p>
+      <w:r>
+        <w:rPr>
+          <w:b/>
+          <w:color w:val="D4A017"/>
+          <w:sz w:val="17"/>
+        </w:rPr>
+        <w:t xml:space="preserve">Utilise pour : </w:t>
+      </w:r>
+      <w:r>
+        <w:rPr>
+          <w:color w:val="555555"/>
+          <w:sz w:val="17"/>
+        </w:rPr>
+        <w:t>Twitter growth, partage connaissance</w:t>
+      </w:r>
+    </w:p>
+    <w:p>
+      <w:pPr>
+        <w:pBdr>
+          <w:bottom w:val="single" w:sz="4" w:space="4" w:color="EEEEEE"/>
+        </w:pBdr>
+      </w:pPr>
+    </w:p>
+    <w:p>
+      <w:r>
+        <w:rPr>
+          <w:b/>
+          <w:color w:val="D4A017"/>
+          <w:sz w:val="18"/>
+        </w:rPr>
+        <w:t xml:space="preserve">#63  </w:t>
+      </w:r>
+      <w:r>
+        <w:rPr>
+          <w:i/>
+          <w:color w:val="333333"/>
+          <w:sz w:val="19"/>
+        </w:rPr>
+        <w:t>"Améliore ce texte : '[texte]'. Rends-le plus persuasif, concis, et orienté bénéfices client."</w:t>
+      </w:r>
+    </w:p>
+    <w:p>
+      <w:r>
+        <w:rPr>
+          <w:b/>
+          <w:color w:val="D4A017"/>
+          <w:sz w:val="17"/>
+        </w:rPr>
+        <w:t xml:space="preserve">Explication : </w:t>
+      </w:r>
+      <w:r>
+        <w:rPr>
+          <w:color w:val="555555"/>
+          <w:sz w:val="17"/>
+        </w:rPr>
+        <w:t>Réécriture persuasive : avantages plutôt que fonctionnalités, phrases courtes.</w:t>
+      </w:r>
+    </w:p>
+    <w:p>
+      <w:r>
+        <w:rPr>
+          <w:b/>
+          <w:color w:val="D4A017"/>
+          <w:sz w:val="17"/>
+        </w:rPr>
+        <w:t xml:space="preserve">Utilise pour : </w:t>
+      </w:r>
+      <w:r>
+        <w:rPr>
+          <w:color w:val="555555"/>
+          <w:sz w:val="17"/>
+        </w:rPr>
+        <w:t>Copywriting, landing pages, emails</w:t>
+      </w:r>
+    </w:p>
+    <w:p>
+      <w:pPr>
+        <w:pBdr>
+          <w:bottom w:val="single" w:sz="4" w:space="4" w:color="EEEEEE"/>
+        </w:pBdr>
+      </w:pPr>
+    </w:p>
+    <w:p>
+      <w:r>
+        <w:rPr>
+          <w:b/>
+          <w:color w:val="D4A017"/>
+          <w:sz w:val="18"/>
+        </w:rPr>
+        <w:t xml:space="preserve">#64  </w:t>
+      </w:r>
+      <w:r>
+        <w:rPr>
+          <w:i/>
+          <w:color w:val="333333"/>
+          <w:sz w:val="19"/>
+        </w:rPr>
+        <w:t>"Crée 5 variations de call-to-action pour mon [produit/service]. Test A/B avec différentes émotions (urgence, FOMO, curiosité)."</w:t>
+      </w:r>
+    </w:p>
+    <w:p>
+      <w:r>
+        <w:rPr>
+          <w:b/>
+          <w:color w:val="D4A017"/>
+          <w:sz w:val="17"/>
+        </w:rPr>
+        <w:t xml:space="preserve">Explication : </w:t>
+      </w:r>
+      <w:r>
+        <w:rPr>
+          <w:color w:val="555555"/>
+          <w:sz w:val="17"/>
+        </w:rPr>
+        <w:t>5 CTA exploitant différents leviers : urgence, FOMO, curiosité, confiance.</w:t>
+      </w:r>
+    </w:p>
+    <w:p>
+      <w:r>
+        <w:rPr>
+          <w:b/>
+          <w:color w:val="D4A017"/>
+          <w:sz w:val="17"/>
+        </w:rPr>
+        <w:t xml:space="preserve">Utilise pour : </w:t>
+      </w:r>
+      <w:r>
+        <w:rPr>
+          <w:color w:val="555555"/>
+          <w:sz w:val="17"/>
+        </w:rPr>
+        <w:t>Augmentation conversion, tests A/B</w:t>
+      </w:r>
+    </w:p>
+    <w:p>
+      <w:pPr>
+        <w:pBdr>
+          <w:bottom w:val="single" w:sz="4" w:space="4" w:color="EEEEEE"/>
+        </w:pBdr>
+      </w:pPr>
+    </w:p>
+    <w:p>
+      <w:r>
+        <w:rPr>
+          <w:b/>
+          <w:color w:val="D4A017"/>
+          <w:sz w:val="18"/>
+        </w:rPr>
+        <w:t xml:space="preserve">#65  </w:t>
+      </w:r>
+      <w:r>
+        <w:rPr>
+          <w:i/>
+          <w:color w:val="333333"/>
+          <w:sz w:val="19"/>
+        </w:rPr>
+        <w:t>"Écris un testimonial fictif mais réaliste pour [SaaS]. Inclis : problème avant, résultat chiffré, émotion."</w:t>
+      </w:r>
+    </w:p>
+    <w:p>
+      <w:r>
+        <w:rPr>
+          <w:b/>
+          <w:color w:val="D4A017"/>
+          <w:sz w:val="17"/>
+        </w:rPr>
+        <w:t xml:space="preserve">Explication : </w:t>
+      </w:r>
+      <w:r>
+        <w:rPr>
+          <w:color w:val="555555"/>
+          <w:sz w:val="17"/>
+        </w:rPr>
+        <w:t>Témoignage réaliste : problème, solution, résultat chiffré, émotion.</w:t>
+      </w:r>
+    </w:p>
+    <w:p>
+      <w:r>
+        <w:rPr>
+          <w:b/>
+          <w:color w:val="D4A017"/>
+          <w:sz w:val="17"/>
+        </w:rPr>
+        <w:t xml:space="preserve">Utilise pour : </w:t>
+      </w:r>
+      <w:r>
+        <w:rPr>
+          <w:color w:val="555555"/>
+          <w:sz w:val="17"/>
+        </w:rPr>
+        <w:t>Preuve sociale, page produit, site web</w:t>
+      </w:r>
+    </w:p>
+    <w:p>
+      <w:pPr>
+        <w:pBdr>
+          <w:bottom w:val="single" w:sz="4" w:space="4" w:color="EEEEEE"/>
+        </w:pBdr>
+      </w:pPr>
+    </w:p>
+    <w:p>
+      <w:r>
+        <w:rPr>
+          <w:b/>
+          <w:color w:val="D4A017"/>
+          <w:sz w:val="18"/>
+        </w:rPr>
+        <w:t xml:space="preserve">#66  </w:t>
+      </w:r>
+      <w:r>
+        <w:rPr>
+          <w:i/>
+          <w:color w:val="333333"/>
+          <w:sz w:val="19"/>
+        </w:rPr>
+        <w:t>"Génère un planning éditorial de 30 jours pour [niche]. 3 formats : éducatif, inspirant, promotionnel."</w:t>
+      </w:r>
+    </w:p>
+    <w:p>
+      <w:r>
+        <w:rPr>
+          <w:b/>
+          <w:color w:val="D4A017"/>
+          <w:sz w:val="17"/>
+        </w:rPr>
+        <w:t xml:space="preserve">Explication : </w:t>
+      </w:r>
+      <w:r>
+        <w:rPr>
+          <w:color w:val="555555"/>
+          <w:sz w:val="17"/>
+        </w:rPr>
+        <w:t>Calendrier mensuel équilibrant 3 formats : éducatif, inspirant, promotionnel.</w:t>
+      </w:r>
+    </w:p>
+    <w:p>
+      <w:r>
+        <w:rPr>
+          <w:b/>
+          <w:color w:val="D4A017"/>
+          <w:sz w:val="17"/>
+        </w:rPr>
+        <w:t xml:space="preserve">Utilise pour : </w:t>
+      </w:r>
+      <w:r>
+        <w:rPr>
+          <w:color w:val="555555"/>
+          <w:sz w:val="17"/>
+        </w:rPr>
+        <w:t>Stratégie contenu, réseaux sociaux</w:t>
+      </w:r>
+    </w:p>
+    <w:p>
+      <w:pPr>
+        <w:pBdr>
+          <w:bottom w:val="single" w:sz="4" w:space="4" w:color="EEEEEE"/>
+        </w:pBdr>
+      </w:pPr>
+    </w:p>
+    <w:p>
+      <w:r>
+        <w:rPr>
+          <w:b/>
+          <w:color w:val="D4A017"/>
+          <w:sz w:val="18"/>
+        </w:rPr>
+        <w:t xml:space="preserve">#67  </w:t>
+      </w:r>
+      <w:r>
+        <w:rPr>
+          <w:i/>
+          <w:color w:val="333333"/>
+          <w:sz w:val="19"/>
+        </w:rPr>
+        <w:t>"Rédige une page 'Pricing' psychologique : 3 plans, comparaison, FAQ sur le prix, et garantie."</w:t>
+      </w:r>
+    </w:p>
+    <w:p>
+      <w:r>
+        <w:rPr>
+          <w:b/>
+          <w:color w:val="D4A017"/>
+          <w:sz w:val="17"/>
+        </w:rPr>
+        <w:t xml:space="preserve">Explication : </w:t>
+      </w:r>
+      <w:r>
+        <w:rPr>
+          <w:color w:val="555555"/>
+          <w:sz w:val="17"/>
+        </w:rPr>
+        <w:t>Page de prix : 3 plans (dont leurre), tableau comparatif, FAQ prix, garantie.</w:t>
+      </w:r>
+    </w:p>
+    <w:p>
+      <w:r>
+        <w:rPr>
+          <w:b/>
+          <w:color w:val="D4A017"/>
+          <w:sz w:val="17"/>
+        </w:rPr>
+        <w:t xml:space="preserve">Utilise pour : </w:t>
+      </w:r>
+      <w:r>
+        <w:rPr>
+          <w:color w:val="555555"/>
+          <w:sz w:val="17"/>
+        </w:rPr>
+        <w:t>Page de vente, conversion, SaaS</w:t>
+      </w:r>
+    </w:p>
+    <w:p>
+      <w:pPr>
+        <w:pBdr>
+          <w:bottom w:val="single" w:sz="4" w:space="4" w:color="EEEEEE"/>
+        </w:pBdr>
+      </w:pPr>
+    </w:p>
+    <w:p>
+      <w:r>
+        <w:rPr>
+          <w:b/>
+          <w:color w:val="D4A017"/>
+          <w:sz w:val="18"/>
+        </w:rPr>
+        <w:t xml:space="preserve">#68  </w:t>
+      </w:r>
+      <w:r>
+        <w:rPr>
+          <w:i/>
+          <w:color w:val="333333"/>
+          <w:sz w:val="19"/>
+        </w:rPr>
+        <w:t>"Transforme ce cas client [description] en étude de cas [problème → solution → résultat] avec citations."</w:t>
+      </w:r>
+    </w:p>
+    <w:p>
+      <w:r>
+        <w:rPr>
+          <w:b/>
+          <w:color w:val="D4A017"/>
+          <w:sz w:val="17"/>
+        </w:rPr>
+        <w:t xml:space="preserve">Explication : </w:t>
+      </w:r>
+      <w:r>
+        <w:rPr>
+          <w:color w:val="555555"/>
+          <w:sz w:val="17"/>
+        </w:rPr>
+        <w:t>Cas client structuré : problème, solution, résultats chiffrés, citations.</w:t>
+      </w:r>
+    </w:p>
+    <w:p>
+      <w:r>
+        <w:rPr>
+          <w:b/>
+          <w:color w:val="D4A017"/>
+          <w:sz w:val="17"/>
+        </w:rPr>
+        <w:t xml:space="preserve">Utilise pour : </w:t>
+      </w:r>
+      <w:r>
+        <w:rPr>
+          <w:color w:val="555555"/>
+          <w:sz w:val="17"/>
+        </w:rPr>
+        <w:t>Études de cas, preuve sociale</w:t>
+      </w:r>
+    </w:p>
+    <w:p>
+      <w:pPr>
+        <w:pBdr>
+          <w:bottom w:val="single" w:sz="4" w:space="4" w:color="EEEEEE"/>
+        </w:pBdr>
+      </w:pPr>
+    </w:p>
+    <w:p>
+      <w:r>
+        <w:rPr>
+          <w:b/>
+          <w:color w:val="D4A017"/>
+          <w:sz w:val="18"/>
+        </w:rPr>
+        <w:t xml:space="preserve">#69  </w:t>
+      </w:r>
+      <w:r>
+        <w:rPr>
+          <w:i/>
+          <w:color w:val="333333"/>
+          <w:sz w:val="19"/>
+        </w:rPr>
+        <w:t>"Écris un script vidéo YouTube de 5 minutes pour [sujet]. Inclis : intro, corps, conclusion, CTA abonnement."</w:t>
+      </w:r>
+    </w:p>
+    <w:p>
+      <w:r>
+        <w:rPr>
+          <w:b/>
+          <w:color w:val="D4A017"/>
+          <w:sz w:val="17"/>
+        </w:rPr>
+        <w:t xml:space="preserve">Explication : </w:t>
+      </w:r>
+      <w:r>
+        <w:rPr>
+          <w:color w:val="555555"/>
+          <w:sz w:val="17"/>
+        </w:rPr>
+        <w:t>Script YouTube 5 min : intro accrocheuse, développement, conclusion, CTA.</w:t>
+      </w:r>
+    </w:p>
+    <w:p>
+      <w:r>
+        <w:rPr>
+          <w:b/>
+          <w:color w:val="D4A017"/>
+          <w:sz w:val="17"/>
+        </w:rPr>
+        <w:t xml:space="preserve">Utilise pour : </w:t>
+      </w:r>
+      <w:r>
+        <w:rPr>
+          <w:color w:val="555555"/>
+          <w:sz w:val="17"/>
+        </w:rPr>
+        <w:t>Chaîne YouTube, tutoriels, démos</w:t>
+      </w:r>
+    </w:p>
+    <w:p>
+      <w:pPr>
+        <w:pBdr>
+          <w:bottom w:val="single" w:sz="4" w:space="4" w:color="EEEEEE"/>
+        </w:pBdr>
+      </w:pPr>
+    </w:p>
+    <w:p>
+      <w:r>
+        <w:rPr>
+          <w:b/>
+          <w:color w:val="D4A017"/>
+          <w:sz w:val="18"/>
+        </w:rPr>
+        <w:t xml:space="preserve">#70  </w:t>
+      </w:r>
+      <w:r>
+        <w:rPr>
+          <w:i/>
+          <w:color w:val="333333"/>
+          <w:sz w:val="19"/>
+        </w:rPr>
+        <w:t>"Génère 10 hooks d'accroche pour une pub Facebook/Instagram sur [produit]. Chaque hook : 5 mots max."</w:t>
+      </w:r>
+    </w:p>
+    <w:p>
+      <w:r>
+        <w:rPr>
+          <w:b/>
+          <w:color w:val="D4A017"/>
+          <w:sz w:val="17"/>
+        </w:rPr>
+        <w:t xml:space="preserve">Explication : </w:t>
+      </w:r>
+      <w:r>
+        <w:rPr>
+          <w:color w:val="555555"/>
+          <w:sz w:val="17"/>
+        </w:rPr>
+        <w:t>10 accroches ultra-courtes (5 mots max) pour publicités sociales.</w:t>
+      </w:r>
+    </w:p>
+    <w:p>
+      <w:r>
+        <w:rPr>
+          <w:b/>
+          <w:color w:val="D4A017"/>
+          <w:sz w:val="17"/>
+        </w:rPr>
+        <w:t xml:space="preserve">Utilise pour : </w:t>
+      </w:r>
+      <w:r>
+        <w:rPr>
+          <w:color w:val="555555"/>
+          <w:sz w:val="17"/>
+        </w:rPr>
+        <w:t>Publicités Facebook/Instagram, ads</w:t>
+      </w:r>
+    </w:p>
+    <w:p>
+      <w:pPr>
+        <w:pBdr>
+          <w:bottom w:val="single" w:sz="4" w:space="4" w:color="EEEEEE"/>
+        </w:pBdr>
+      </w:pPr>
+    </w:p>
+    <w:p>
+      <w:r>
+        <w:rPr>
+          <w:b/>
+          <w:color w:val="D4A017"/>
+          <w:sz w:val="18"/>
+        </w:rPr>
+        <w:t xml:space="preserve">#71  </w:t>
+      </w:r>
+      <w:r>
+        <w:rPr>
+          <w:i/>
+          <w:color w:val="333333"/>
+          <w:sz w:val="19"/>
+        </w:rPr>
+        <w:t>"Crée une séquence de 3 emails de relance pour panier abandonné. Ton progressif : rappel → valeur → urgence."</w:t>
+      </w:r>
+    </w:p>
+    <w:p>
+      <w:r>
+        <w:rPr>
+          <w:b/>
+          <w:color w:val="D4A017"/>
+          <w:sz w:val="17"/>
+        </w:rPr>
+        <w:t xml:space="preserve">Explication : </w:t>
+      </w:r>
+      <w:r>
+        <w:rPr>
+          <w:color w:val="555555"/>
+          <w:sz w:val="17"/>
+        </w:rPr>
+        <w:t>3 emails de relance progressifs : rappel, valeur, urgence.</w:t>
+      </w:r>
+    </w:p>
+    <w:p>
+      <w:r>
+        <w:rPr>
+          <w:b/>
+          <w:color w:val="D4A017"/>
+          <w:sz w:val="17"/>
+        </w:rPr>
+        <w:t xml:space="preserve">Utilise pour : </w:t>
+      </w:r>
+      <w:r>
+        <w:rPr>
+          <w:color w:val="555555"/>
+          <w:sz w:val="17"/>
+        </w:rPr>
+        <w:t>E-commerce, récupération panier, CA</w:t>
+      </w:r>
+    </w:p>
+    <w:p>
+      <w:pPr>
+        <w:pBdr>
+          <w:bottom w:val="single" w:sz="4" w:space="4" w:color="EEEEEE"/>
+        </w:pBdr>
+      </w:pPr>
+    </w:p>
+    <w:p>
+      <w:r>
+        <w:rPr>
+          <w:b/>
+          <w:color w:val="D4A017"/>
+          <w:sz w:val="18"/>
+        </w:rPr>
+        <w:t xml:space="preserve">#72  </w:t>
+      </w:r>
+      <w:r>
+        <w:rPr>
+          <w:i/>
+          <w:color w:val="333333"/>
+          <w:sz w:val="19"/>
+        </w:rPr>
+        <w:t>"Rédige une page 'Error 404' créative et fun pour mon SaaS [nom]. Peut inclure un mini-jeu ou une blague."</w:t>
+      </w:r>
+    </w:p>
+    <w:p>
+      <w:r>
+        <w:rPr>
+          <w:b/>
+          <w:color w:val="D4A017"/>
+          <w:sz w:val="17"/>
+        </w:rPr>
+        <w:t xml:space="preserve">Explication : </w:t>
+      </w:r>
+      <w:r>
+        <w:rPr>
+          <w:color w:val="555555"/>
+          <w:sz w:val="17"/>
+        </w:rPr>
+        <w:t>Page 404 personnalisée avec humour, mini-jeu ou easter egg.</w:t>
+      </w:r>
+    </w:p>
+    <w:p>
+      <w:r>
+        <w:rPr>
+          <w:b/>
+          <w:color w:val="D4A017"/>
+          <w:sz w:val="17"/>
+        </w:rPr>
+        <w:t xml:space="preserve">Utilise pour : </w:t>
+      </w:r>
+      <w:r>
+        <w:rPr>
+          <w:color w:val="555555"/>
+          <w:sz w:val="17"/>
+        </w:rPr>
+        <w:t>UX design, branding, surprise positive</w:t>
+      </w:r>
+    </w:p>
+    <w:p>
+      <w:pPr>
+        <w:pBdr>
+          <w:bottom w:val="single" w:sz="4" w:space="4" w:color="EEEEEE"/>
+        </w:pBdr>
+      </w:pPr>
+    </w:p>
+    <w:p>
+      <w:r>
+        <w:rPr>
+          <w:b/>
+          <w:color w:val="D4A017"/>
+          <w:sz w:val="18"/>
+        </w:rPr>
+        <w:t xml:space="preserve">#73  </w:t>
+      </w:r>
+      <w:r>
+        <w:rPr>
+          <w:i/>
+          <w:color w:val="333333"/>
+          <w:sz w:val="19"/>
+        </w:rPr>
+        <w:t>"Génère un script de réponse automatique pour mon chatbot support : 10 scénarios courants avec réponses."</w:t>
+      </w:r>
+    </w:p>
+    <w:p>
+      <w:r>
+        <w:rPr>
+          <w:b/>
+          <w:color w:val="D4A017"/>
+          <w:sz w:val="17"/>
+        </w:rPr>
+        <w:t xml:space="preserve">Explication : </w:t>
+      </w:r>
+      <w:r>
+        <w:rPr>
+          <w:color w:val="555555"/>
+          <w:sz w:val="17"/>
+        </w:rPr>
+        <w:t>10 scénarios support avec réponses automatiques pour chatbot.</w:t>
+      </w:r>
+    </w:p>
+    <w:p>
+      <w:r>
+        <w:rPr>
+          <w:b/>
+          <w:color w:val="D4A017"/>
+          <w:sz w:val="17"/>
+        </w:rPr>
+        <w:t xml:space="preserve">Utilise pour : </w:t>
+      </w:r>
+      <w:r>
+        <w:rPr>
+          <w:color w:val="555555"/>
+          <w:sz w:val="17"/>
+        </w:rPr>
+        <w:t>Chatbot, réduction temps réponse</w:t>
+      </w:r>
+    </w:p>
+    <w:p>
+      <w:pPr>
+        <w:pBdr>
+          <w:bottom w:val="single" w:sz="4" w:space="4" w:color="EEEEEE"/>
+        </w:pBdr>
+      </w:pPr>
+    </w:p>
+    <w:p>
+      <w:r>
+        <w:rPr>
+          <w:b/>
+          <w:color w:val="D4A017"/>
+          <w:sz w:val="18"/>
+        </w:rPr>
+        <w:t xml:space="preserve">#74  </w:t>
+      </w:r>
+      <w:r>
+        <w:rPr>
+          <w:i/>
+          <w:color w:val="333333"/>
+          <w:sz w:val="19"/>
+        </w:rPr>
+        <w:t>"Analyse ce concurrent [nom]. Forces, faiblesses, opportunités, menaces (SWOT). Que puis-je copier/éviter ?"</w:t>
+      </w:r>
+    </w:p>
+    <w:p>
+      <w:r>
+        <w:rPr>
+          <w:b/>
+          <w:color w:val="D4A017"/>
+          <w:sz w:val="17"/>
+        </w:rPr>
+        <w:t xml:space="preserve">Explication : </w:t>
+      </w:r>
+      <w:r>
+        <w:rPr>
+          <w:color w:val="555555"/>
+          <w:sz w:val="17"/>
+        </w:rPr>
+        <w:t>Analyse SWOT complète : forces, faiblesses, opportunités, menaces.</w:t>
+      </w:r>
+    </w:p>
+    <w:p>
+      <w:r>
+        <w:rPr>
+          <w:b/>
+          <w:color w:val="D4A017"/>
+          <w:sz w:val="17"/>
+        </w:rPr>
+        <w:t xml:space="preserve">Utilise pour : </w:t>
+      </w:r>
+      <w:r>
+        <w:rPr>
+          <w:color w:val="555555"/>
+          <w:sz w:val="17"/>
+        </w:rPr>
+        <w:t>Veille concurrentielle, stratégie</w:t>
+      </w:r>
+    </w:p>
+    <w:p>
+      <w:pPr>
+        <w:pBdr>
+          <w:bottom w:val="single" w:sz="4" w:space="4" w:color="EEEEEE"/>
+        </w:pBdr>
+      </w:pPr>
+    </w:p>
+    <w:p>
+      <w:r>
+        <w:rPr>
+          <w:b/>
+          <w:color w:val="D4A017"/>
+          <w:sz w:val="18"/>
+        </w:rPr>
+        <w:t xml:space="preserve">#75  </w:t>
+      </w:r>
+      <w:r>
+        <w:rPr>
+          <w:i/>
+          <w:color w:val="333333"/>
+          <w:sz w:val="19"/>
+        </w:rPr>
+        <w:t>"Écris 5 variantes de ma bio LinkedIn/Twitter. Chacune pour un angle différent : tech, business, humour, mission."</w:t>
+      </w:r>
+    </w:p>
+    <w:p>
+      <w:r>
+        <w:rPr>
+          <w:b/>
+          <w:color w:val="D4A017"/>
+          <w:sz w:val="17"/>
+        </w:rPr>
+        <w:t xml:space="preserve">Explication : </w:t>
+      </w:r>
+      <w:r>
+        <w:rPr>
+          <w:color w:val="555555"/>
+          <w:sz w:val="17"/>
+        </w:rPr>
+        <w:t>5 bios pro selon différents angles : tech, business, humour, mission.</w:t>
+      </w:r>
+    </w:p>
+    <w:p>
+      <w:r>
+        <w:rPr>
+          <w:b/>
+          <w:color w:val="D4A017"/>
+          <w:sz w:val="17"/>
+        </w:rPr>
+        <w:t xml:space="preserve">Utilise pour : </w:t>
+      </w:r>
+      <w:r>
+        <w:rPr>
+          <w:color w:val="555555"/>
+          <w:sz w:val="17"/>
+        </w:rPr>
+        <w:t>Personal branding, réseaux pros</w:t>
+      </w:r>
+    </w:p>
+    <w:p>
+      <w:pPr>
+        <w:pBdr>
+          <w:bottom w:val="single" w:sz="4" w:space="4" w:color="EEEEEE"/>
+        </w:pBdr>
+      </w:pPr>
+    </w:p>
+    <w:p>
+      <w:r>
+        <w:rPr>
+          <w:b/>
+          <w:color w:val="D4A017"/>
+          <w:sz w:val="18"/>
+        </w:rPr>
+        <w:t xml:space="preserve">#76  </w:t>
+      </w:r>
+      <w:r>
+        <w:rPr>
+          <w:i/>
+          <w:color w:val="333333"/>
+          <w:sz w:val="19"/>
+        </w:rPr>
+        <w:t>"Crée un communiqué de presse de 400 mots pour le lancement de [produit]. Structure : 5W + quote fondateur."</w:t>
+      </w:r>
+    </w:p>
+    <w:p>
+      <w:r>
+        <w:rPr>
+          <w:b/>
+          <w:color w:val="D4A017"/>
+          <w:sz w:val="17"/>
+        </w:rPr>
+        <w:t xml:space="preserve">Explication : </w:t>
+      </w:r>
+      <w:r>
+        <w:rPr>
+          <w:color w:val="555555"/>
+          <w:sz w:val="17"/>
+        </w:rPr>
+        <w:t>Communiqué de presse formaté : 5W + citation fondateur + contacts.</w:t>
+      </w:r>
+    </w:p>
+    <w:p>
+      <w:r>
+        <w:rPr>
+          <w:b/>
+          <w:color w:val="D4A017"/>
+          <w:sz w:val="17"/>
+        </w:rPr>
+        <w:t xml:space="preserve">Utilise pour : </w:t>
+      </w:r>
+      <w:r>
+        <w:rPr>
+          <w:color w:val="555555"/>
+          <w:sz w:val="17"/>
+        </w:rPr>
+        <w:t>Lancement produit, relations presse</w:t>
+      </w:r>
+    </w:p>
+    <w:p>
+      <w:pPr>
+        <w:pBdr>
+          <w:bottom w:val="single" w:sz="4" w:space="4" w:color="EEEEEE"/>
+        </w:pBdr>
+      </w:pPr>
+    </w:p>
+    <w:p>
+      <w:r>
+        <w:rPr>
+          <w:b/>
+          <w:color w:val="D4A017"/>
+          <w:sz w:val="18"/>
+        </w:rPr>
+        <w:t xml:space="preserve">#77  </w:t>
+      </w:r>
+      <w:r>
+        <w:rPr>
+          <w:i/>
+          <w:color w:val="333333"/>
+          <w:sz w:val="19"/>
+        </w:rPr>
+        <w:t>"Génère un script de podcast intro de 30 secondes pour [sujet]. Inclis : hook, présentation, teaser."</w:t>
+      </w:r>
+    </w:p>
+    <w:p>
+      <w:r>
+        <w:rPr>
+          <w:b/>
+          <w:color w:val="D4A017"/>
+          <w:sz w:val="17"/>
+        </w:rPr>
+        <w:t xml:space="preserve">Explication : </w:t>
+      </w:r>
+      <w:r>
+        <w:rPr>
+          <w:color w:val="555555"/>
+          <w:sz w:val="17"/>
+        </w:rPr>
+        <w:t>Intro podcast 30s : hook, présentation, teaser contenu.</w:t>
+      </w:r>
+    </w:p>
+    <w:p>
+      <w:r>
+        <w:rPr>
+          <w:b/>
+          <w:color w:val="D4A017"/>
+          <w:sz w:val="17"/>
+        </w:rPr>
+        <w:t xml:space="preserve">Utilise pour : </w:t>
+      </w:r>
+      <w:r>
+        <w:rPr>
+          <w:color w:val="555555"/>
+          <w:sz w:val="17"/>
+        </w:rPr>
+        <w:t>Podcast, contenu audio, branding</w:t>
+      </w:r>
+    </w:p>
+    <w:p>
+      <w:pPr>
+        <w:pBdr>
+          <w:bottom w:val="single" w:sz="4" w:space="4" w:color="EEEEEE"/>
+        </w:pBdr>
+      </w:pPr>
+    </w:p>
+    <w:p>
+      <w:r>
+        <w:rPr>
+          <w:b/>
+          <w:color w:val="D4A017"/>
+          <w:sz w:val="18"/>
+        </w:rPr>
+        <w:t xml:space="preserve">#78  </w:t>
+      </w:r>
+      <w:r>
+        <w:rPr>
+          <w:i/>
+          <w:color w:val="333333"/>
+          <w:sz w:val="19"/>
+        </w:rPr>
+        <w:t>"Rédige un guide ultime de [sujet] en 10 points. Chaque point : titre, explication, exemple, action."</w:t>
+      </w:r>
+    </w:p>
+    <w:p>
+      <w:r>
+        <w:rPr>
+          <w:b/>
+          <w:color w:val="D4A017"/>
+          <w:sz w:val="17"/>
+        </w:rPr>
+        <w:t xml:space="preserve">Explication : </w:t>
+      </w:r>
+      <w:r>
+        <w:rPr>
+          <w:color w:val="555555"/>
+          <w:sz w:val="17"/>
+        </w:rPr>
+        <w:t>Guide 10 points : titre, explication, exemple, action par section.</w:t>
+      </w:r>
+    </w:p>
+    <w:p>
+      <w:r>
+        <w:rPr>
+          <w:b/>
+          <w:color w:val="D4A017"/>
+          <w:sz w:val="17"/>
+        </w:rPr>
+        <w:t xml:space="preserve">Utilise pour : </w:t>
+      </w:r>
+      <w:r>
+        <w:rPr>
+          <w:color w:val="555555"/>
+          <w:sz w:val="17"/>
+        </w:rPr>
+        <w:t>Lead magnet, contenu premium, SEO</w:t>
+      </w:r>
+    </w:p>
+    <w:p>
+      <w:pPr>
+        <w:pBdr>
+          <w:bottom w:val="single" w:sz="4" w:space="4" w:color="EEEEEE"/>
+        </w:pBdr>
+      </w:pPr>
+    </w:p>
+    <w:p>
+      <w:r>
+        <w:rPr>
+          <w:b/>
+          <w:color w:val="D4A017"/>
+          <w:sz w:val="18"/>
+        </w:rPr>
+        <w:t xml:space="preserve">#79  </w:t>
+      </w:r>
+      <w:r>
+        <w:rPr>
+          <w:i/>
+          <w:color w:val="333333"/>
+          <w:sz w:val="19"/>
+        </w:rPr>
+        <w:t>"Crée un post LinkedIn 'hot take' sur [trend tech]. Opinion forte, données à l'appui, question pour engager."</w:t>
+      </w:r>
+    </w:p>
+    <w:p>
+      <w:r>
+        <w:rPr>
+          <w:b/>
+          <w:color w:val="D4A017"/>
+          <w:sz w:val="17"/>
+        </w:rPr>
+        <w:t xml:space="preserve">Explication : </w:t>
+      </w:r>
+      <w:r>
+        <w:rPr>
+          <w:color w:val="555555"/>
+          <w:sz w:val="17"/>
+        </w:rPr>
+        <w:t>Post opinion provocateur mais argumenté, données, question engagement.</w:t>
+      </w:r>
+    </w:p>
+    <w:p>
+      <w:r>
+        <w:rPr>
+          <w:b/>
+          <w:color w:val="D4A017"/>
+          <w:sz w:val="17"/>
+        </w:rPr>
+        <w:t xml:space="preserve">Utilise pour : </w:t>
+      </w:r>
+      <w:r>
+        <w:rPr>
+          <w:color w:val="555555"/>
+          <w:sz w:val="17"/>
+        </w:rPr>
+        <w:t>LinkedIn, thought leadership</w:t>
+      </w:r>
+    </w:p>
+    <w:p>
+      <w:pPr>
+        <w:pBdr>
+          <w:bottom w:val="single" w:sz="4" w:space="4" w:color="EEEEEE"/>
+        </w:pBdr>
+      </w:pPr>
+    </w:p>
+    <w:p>
+      <w:r>
+        <w:rPr>
+          <w:b/>
+          <w:color w:val="D4A017"/>
+          <w:sz w:val="18"/>
+        </w:rPr>
+        <w:t xml:space="preserve">#80  </w:t>
+      </w:r>
+      <w:r>
+        <w:rPr>
+          <w:i/>
+          <w:color w:val="333333"/>
+          <w:sz w:val="19"/>
+        </w:rPr>
+        <w:t>"Écris un email de bienvenue pour [SaaS] de 5 lignes max : remerciement, prochaine étape, CTA principal."</w:t>
+      </w:r>
+    </w:p>
+    <w:p>
+      <w:r>
+        <w:rPr>
+          <w:b/>
+          <w:color w:val="D4A017"/>
+          <w:sz w:val="17"/>
+        </w:rPr>
+        <w:t xml:space="preserve">Explication : </w:t>
+      </w:r>
+      <w:r>
+        <w:rPr>
+          <w:color w:val="555555"/>
+          <w:sz w:val="17"/>
+        </w:rPr>
+        <w:t>Email bienvenue 5 lignes : remerciement, action claire, CTA principal.</w:t>
+      </w:r>
+    </w:p>
+    <w:p>
+      <w:r>
+        <w:rPr>
+          <w:b/>
+          <w:color w:val="D4A017"/>
+          <w:sz w:val="17"/>
+        </w:rPr>
+        <w:t xml:space="preserve">Utilise pour : </w:t>
+      </w:r>
+      <w:r>
+        <w:rPr>
+          <w:color w:val="555555"/>
+          <w:sz w:val="17"/>
+        </w:rPr>
+        <w:t>Onboarding, activation, rétention</w:t>
+      </w:r>
+    </w:p>
+    <w:p>
+      <w:pPr>
+        <w:pBdr>
+          <w:bottom w:val="single" w:sz="4" w:space="4" w:color="EEEEEE"/>
+        </w:pBdr>
+      </w:pPr>
+    </w:p>
+    <w:p>
+      <w:r>
+        <w:rPr>
+          <w:b/>
+          <w:color w:val="D4A017"/>
+          <w:sz w:val="18"/>
+        </w:rPr>
+        <w:t xml:space="preserve">#81  </w:t>
+      </w:r>
+      <w:r>
+        <w:rPr>
+          <w:i/>
+          <w:color w:val="333333"/>
+          <w:sz w:val="19"/>
+        </w:rPr>
+        <w:t>"Génère une checklist SEO on-page pour mon article : H1, H2, alt text, internal links, schema markup."</w:t>
+      </w:r>
+    </w:p>
+    <w:p>
+      <w:r>
+        <w:rPr>
+          <w:b/>
+          <w:color w:val="D4A017"/>
+          <w:sz w:val="17"/>
+        </w:rPr>
+        <w:t xml:space="preserve">Explication : </w:t>
+      </w:r>
+      <w:r>
+        <w:rPr>
+          <w:color w:val="555555"/>
+          <w:sz w:val="17"/>
+        </w:rPr>
+        <w:t>Checklist SEO : H1, H2, alt text, liens internes, schema markup.</w:t>
+      </w:r>
+    </w:p>
+    <w:p>
+      <w:r>
+        <w:rPr>
+          <w:b/>
+          <w:color w:val="D4A017"/>
+          <w:sz w:val="17"/>
+        </w:rPr>
+        <w:t xml:space="preserve">Utilise pour : </w:t>
+      </w:r>
+      <w:r>
+        <w:rPr>
+          <w:color w:val="555555"/>
+          <w:sz w:val="17"/>
+        </w:rPr>
+        <w:t>SEO on-page, publication article</w:t>
+      </w:r>
+    </w:p>
+    <w:p>
+      <w:pPr>
+        <w:pBdr>
+          <w:bottom w:val="single" w:sz="4" w:space="4" w:color="EEEEEE"/>
+        </w:pBdr>
+      </w:pPr>
+    </w:p>
+    <w:p>
+      <w:r>
+        <w:rPr>
+          <w:b/>
+          <w:color w:val="D4A017"/>
+          <w:sz w:val="18"/>
+        </w:rPr>
+        <w:t xml:space="preserve">#82  </w:t>
+      </w:r>
+      <w:r>
+        <w:rPr>
+          <w:i/>
+          <w:color w:val="333333"/>
+          <w:sz w:val="19"/>
+        </w:rPr>
+        <w:t>"Rédige un comparatif [produit A] vs [produit B] : objectif, table, verdict, et recommandation selon le besoin."</w:t>
+      </w:r>
+    </w:p>
+    <w:p>
+      <w:r>
+        <w:rPr>
+          <w:b/>
+          <w:color w:val="D4A017"/>
+          <w:sz w:val="17"/>
+        </w:rPr>
+        <w:t xml:space="preserve">Explication : </w:t>
+      </w:r>
+      <w:r>
+        <w:rPr>
+          <w:color w:val="555555"/>
+          <w:sz w:val="17"/>
+        </w:rPr>
+        <w:t>Comparatif structuré : critères objectifs, tableau, verdict, recommandation.</w:t>
+      </w:r>
+    </w:p>
+    <w:p>
+      <w:r>
+        <w:rPr>
+          <w:b/>
+          <w:color w:val="D4A017"/>
+          <w:sz w:val="17"/>
+        </w:rPr>
+        <w:t xml:space="preserve">Utilise pour : </w:t>
+      </w:r>
+      <w:r>
+        <w:rPr>
+          <w:color w:val="555555"/>
+          <w:sz w:val="17"/>
+        </w:rPr>
+        <w:t>SEO comparative, contenu décision</w:t>
+      </w:r>
+    </w:p>
+    <w:p>
+      <w:pPr>
+        <w:pBdr>
+          <w:bottom w:val="single" w:sz="4" w:space="4" w:color="EEEEEE"/>
+        </w:pBdr>
+      </w:pPr>
+    </w:p>
+    <w:p>
+      <w:r>
+        <w:rPr>
+          <w:b/>
+          <w:color w:val="D4A017"/>
+          <w:sz w:val="18"/>
+        </w:rPr>
+        <w:t xml:space="preserve">#83  </w:t>
+      </w:r>
+      <w:r>
+        <w:rPr>
+          <w:i/>
+          <w:color w:val="333333"/>
+          <w:sz w:val="19"/>
+        </w:rPr>
+        <w:t>"Crée un storytelling 'origin story' pour [marque/projet] en 3 actes : le déclic, la lutte, la victoire."</w:t>
+      </w:r>
+    </w:p>
+    <w:p>
+      <w:r>
+        <w:rPr>
+          <w:b/>
+          <w:color w:val="D4A017"/>
+          <w:sz w:val="17"/>
+        </w:rPr>
+        <w:t xml:space="preserve">Explication : </w:t>
+      </w:r>
+      <w:r>
+        <w:rPr>
+          <w:color w:val="555555"/>
+          <w:sz w:val="17"/>
+        </w:rPr>
+        <w:t>Storytelling en 3 actes : déclic, lutte, victoire.</w:t>
+      </w:r>
+    </w:p>
+    <w:p>
+      <w:r>
+        <w:rPr>
+          <w:b/>
+          <w:color w:val="D4A017"/>
+          <w:sz w:val="17"/>
+        </w:rPr>
+        <w:t xml:space="preserve">Utilise pour : </w:t>
+      </w:r>
+      <w:r>
+        <w:rPr>
+          <w:color w:val="555555"/>
+          <w:sz w:val="17"/>
+        </w:rPr>
+        <w:t>Branding, page About, émotion</w:t>
+      </w:r>
+    </w:p>
+    <w:p>
+      <w:pPr>
+        <w:pBdr>
+          <w:bottom w:val="single" w:sz="4" w:space="4" w:color="EEEEEE"/>
+        </w:pBdr>
+      </w:pPr>
+    </w:p>
+    <w:p>
+      <w:r>
+        <w:rPr>
+          <w:b/>
+          <w:color w:val="D4A017"/>
+          <w:sz w:val="18"/>
+        </w:rPr>
+        <w:t xml:space="preserve">#84  </w:t>
+      </w:r>
+      <w:r>
+        <w:rPr>
+          <w:i/>
+          <w:color w:val="333333"/>
+          <w:sz w:val="19"/>
+        </w:rPr>
+        <w:t>"Écris 5 réponses types pour gérer les objections clients sur le prix : justifier la valeur, comparer, offrir un palier."</w:t>
+      </w:r>
+    </w:p>
+    <w:p>
+      <w:r>
+        <w:rPr>
+          <w:b/>
+          <w:color w:val="D4A017"/>
+          <w:sz w:val="17"/>
+        </w:rPr>
+        <w:t xml:space="preserve">Explication : </w:t>
+      </w:r>
+      <w:r>
+        <w:rPr>
+          <w:color w:val="555555"/>
+          <w:sz w:val="17"/>
+        </w:rPr>
+        <w:t>5 réponses aux objections prix : valeur, comparaison, palier.</w:t>
+      </w:r>
+    </w:p>
+    <w:p>
+      <w:r>
+        <w:rPr>
+          <w:b/>
+          <w:color w:val="D4A017"/>
+          <w:sz w:val="17"/>
+        </w:rPr>
+        <w:t xml:space="preserve">Utilise pour : </w:t>
+      </w:r>
+      <w:r>
+        <w:rPr>
+          <w:color w:val="555555"/>
+          <w:sz w:val="17"/>
+        </w:rPr>
+        <w:t>Vente, objection handling, closing</w:t>
+      </w:r>
+    </w:p>
+    <w:p>
+      <w:pPr>
+        <w:pBdr>
+          <w:bottom w:val="single" w:sz="4" w:space="4" w:color="EEEEEE"/>
+        </w:pBdr>
+      </w:pPr>
+    </w:p>
+    <w:p>
+      <w:r>
+        <w:rPr>
+          <w:b/>
+          <w:color w:val="D4A017"/>
+          <w:sz w:val="18"/>
+        </w:rPr>
+        <w:t xml:space="preserve">#85  </w:t>
+      </w:r>
+      <w:r>
+        <w:rPr>
+          <w:i/>
+          <w:color w:val="333333"/>
+          <w:sz w:val="19"/>
+        </w:rPr>
+        <w:t>"Génère un plan de contenu pour un webinaire de 45 minutes sur [sujet]. Timing, slides, engagement, CTA."</w:t>
+      </w:r>
+    </w:p>
+    <w:p>
+      <w:r>
+        <w:rPr>
+          <w:b/>
+          <w:color w:val="D4A017"/>
+          <w:sz w:val="17"/>
+        </w:rPr>
+        <w:t xml:space="preserve">Explication : </w:t>
+      </w:r>
+      <w:r>
+        <w:rPr>
+          <w:color w:val="555555"/>
+          <w:sz w:val="17"/>
+        </w:rPr>
+        <w:t>Plan webinaire minute par minute : slides, engagement, CTA.</w:t>
+      </w:r>
+    </w:p>
+    <w:p>
+      <w:r>
+        <w:rPr>
+          <w:b/>
+          <w:color w:val="D4A017"/>
+          <w:sz w:val="17"/>
+        </w:rPr>
+        <w:t xml:space="preserve">Utilise pour : </w:t>
+      </w:r>
+      <w:r>
+        <w:rPr>
+          <w:color w:val="555555"/>
+          <w:sz w:val="17"/>
+        </w:rPr>
+        <w:t>Webinaire, lead gen, éducation client</w:t>
+      </w:r>
+    </w:p>
+    <w:p>
+      <w:pPr>
+        <w:pBdr>
+          <w:bottom w:val="single" w:sz="4" w:space="4" w:color="EEEEEE"/>
+        </w:pBdr>
+      </w:pPr>
+    </w:p>
+    <w:p>
+      <w:r>
+        <w:br w:type="page"/>
+      </w:r>
+    </w:p>
+    <w:p>
+      <w:r>
+        <w:rPr>
+          <w:b/>
+          <w:color w:val="D4A017"/>
+          <w:sz w:val="28"/>
+        </w:rPr>
+        <w:t>Bonus — Prompts pour Améliorer des Prompts (15 prompts)</w:t>
+      </w:r>
+    </w:p>
+    <w:p>
+      <w:r>
+        <w:rPr>
+          <w:b/>
+          <w:color w:val="D4A017"/>
+          <w:sz w:val="18"/>
+        </w:rPr>
+        <w:t xml:space="preserve">#86  </w:t>
+      </w:r>
+      <w:r>
+        <w:rPr>
+          <w:i/>
+          <w:color w:val="333333"/>
+          <w:sz w:val="19"/>
+        </w:rPr>
+        <w:t>"Analyse ce prompt : '[prompt]'. Comment le rendre plus précis, plus contraint, et plus fiable ? Propose 3 versions améliorées."</w:t>
+      </w:r>
+    </w:p>
+    <w:p>
+      <w:r>
+        <w:rPr>
+          <w:b/>
+          <w:color w:val="D4A017"/>
+          <w:sz w:val="17"/>
+        </w:rPr>
+        <w:t xml:space="preserve">Explication : </w:t>
+      </w:r>
+      <w:r>
+        <w:rPr>
+          <w:color w:val="555555"/>
+          <w:sz w:val="17"/>
+        </w:rPr>
+        <w:t>Audit de prompt avec 3 versions améliorées : précision, contraintes, fiabilité.</w:t>
+      </w:r>
+    </w:p>
+    <w:p>
+      <w:r>
+        <w:rPr>
+          <w:b/>
+          <w:color w:val="D4A017"/>
+          <w:sz w:val="17"/>
+        </w:rPr>
+        <w:t xml:space="preserve">Utilise pour : </w:t>
+      </w:r>
+      <w:r>
+        <w:rPr>
+          <w:color w:val="555555"/>
+          <w:sz w:val="17"/>
+        </w:rPr>
+        <w:t>Améliorer prompts, debugging</w:t>
+      </w:r>
+    </w:p>
+    <w:p>
+      <w:pPr>
+        <w:pBdr>
+          <w:bottom w:val="single" w:sz="4" w:space="4" w:color="EEEEEE"/>
+        </w:pBdr>
+      </w:pPr>
+    </w:p>
+    <w:p>
+      <w:r>
+        <w:rPr>
+          <w:b/>
+          <w:color w:val="D4A017"/>
+          <w:sz w:val="18"/>
+        </w:rPr>
+        <w:t xml:space="preserve">#87  </w:t>
+      </w:r>
+      <w:r>
+        <w:rPr>
+          <w:i/>
+          <w:color w:val="333333"/>
+          <w:sz w:val="19"/>
+        </w:rPr>
+        <w:t>"Je veux un prompt qui génère [résultat]. Aide-moi à le structurer : rôle, contexte, tâche, format, exemples, contraintes."</w:t>
+      </w:r>
+    </w:p>
+    <w:p>
+      <w:r>
+        <w:rPr>
+          <w:b/>
+          <w:color w:val="D4A017"/>
+          <w:sz w:val="17"/>
+        </w:rPr>
+        <w:t xml:space="preserve">Explication : </w:t>
+      </w:r>
+      <w:r>
+        <w:rPr>
+          <w:color w:val="555555"/>
+          <w:sz w:val="17"/>
+        </w:rPr>
+        <w:t>Méthodologie 6 composantes : rôle, contexte, tâche, format, exemples, contraintes.</w:t>
+      </w:r>
+    </w:p>
+    <w:p>
+      <w:r>
+        <w:rPr>
+          <w:b/>
+          <w:color w:val="D4A017"/>
+          <w:sz w:val="17"/>
+        </w:rPr>
+        <w:t xml:space="preserve">Utilise pour : </w:t>
+      </w:r>
+      <w:r>
+        <w:rPr>
+          <w:color w:val="555555"/>
+          <w:sz w:val="17"/>
+        </w:rPr>
+        <w:t>Création prompts from scratch</w:t>
+      </w:r>
+    </w:p>
+    <w:p>
+      <w:pPr>
+        <w:pBdr>
+          <w:bottom w:val="single" w:sz="4" w:space="4" w:color="EEEEEE"/>
+        </w:pBdr>
+      </w:pPr>
+    </w:p>
+    <w:p>
+      <w:r>
+        <w:rPr>
+          <w:b/>
+          <w:color w:val="D4A017"/>
+          <w:sz w:val="18"/>
+        </w:rPr>
+        <w:t xml:space="preserve">#88  </w:t>
+      </w:r>
+      <w:r>
+        <w:rPr>
+          <w:i/>
+          <w:color w:val="333333"/>
+          <w:sz w:val="19"/>
+        </w:rPr>
+        <w:t>"Ce prompt [prompt] donne des résultats trop génériques. Ajoute des contraintes de style, ton, longueur, et audience cible."</w:t>
+      </w:r>
+    </w:p>
+    <w:p>
+      <w:r>
+        <w:rPr>
+          <w:b/>
+          <w:color w:val="D4A017"/>
+          <w:sz w:val="17"/>
+        </w:rPr>
+        <w:t xml:space="preserve">Explication : </w:t>
+      </w:r>
+      <w:r>
+        <w:rPr>
+          <w:color w:val="555555"/>
+          <w:sz w:val="17"/>
+        </w:rPr>
+        <w:t>Enrichit un prompt vague avec contraintes : style, ton, longueur, audience.</w:t>
+      </w:r>
+    </w:p>
+    <w:p>
+      <w:r>
+        <w:rPr>
+          <w:b/>
+          <w:color w:val="D4A017"/>
+          <w:sz w:val="17"/>
+        </w:rPr>
+        <w:t xml:space="preserve">Utilise pour : </w:t>
+      </w:r>
+      <w:r>
+        <w:rPr>
+          <w:color w:val="555555"/>
+          <w:sz w:val="17"/>
+        </w:rPr>
+        <w:t>Affinage prompts, personnalisation</w:t>
+      </w:r>
+    </w:p>
+    <w:p>
+      <w:pPr>
+        <w:pBdr>
+          <w:bottom w:val="single" w:sz="4" w:space="4" w:color="EEEEEE"/>
+        </w:pBdr>
+      </w:pPr>
+    </w:p>
+    <w:p>
+      <w:r>
+        <w:rPr>
+          <w:b/>
+          <w:color w:val="D4A017"/>
+          <w:sz w:val="18"/>
+        </w:rPr>
+        <w:t xml:space="preserve">#89  </w:t>
+      </w:r>
+      <w:r>
+        <w:rPr>
+          <w:i/>
+          <w:color w:val="333333"/>
+          <w:sz w:val="19"/>
+        </w:rPr>
+        <w:t>"Génère 5 variantes de ce prompt [prompt] en changeant : le niveau de détail, la persona, le format de sortie."</w:t>
+      </w:r>
+    </w:p>
+    <w:p>
+      <w:r>
+        <w:rPr>
+          <w:b/>
+          <w:color w:val="D4A017"/>
+          <w:sz w:val="17"/>
+        </w:rPr>
+        <w:t xml:space="preserve">Explication : </w:t>
+      </w:r>
+      <w:r>
+        <w:rPr>
+          <w:color w:val="555555"/>
+          <w:sz w:val="17"/>
+        </w:rPr>
+        <w:t>5 variantes d'un même prompt avec paramètres variables pour test.</w:t>
+      </w:r>
+    </w:p>
+    <w:p>
+      <w:r>
+        <w:rPr>
+          <w:b/>
+          <w:color w:val="D4A017"/>
+          <w:sz w:val="17"/>
+        </w:rPr>
+        <w:t xml:space="preserve">Utilise pour : </w:t>
+      </w:r>
+      <w:r>
+        <w:rPr>
+          <w:color w:val="555555"/>
+          <w:sz w:val="17"/>
+        </w:rPr>
+        <w:t>Tests A/B prompts, optimisation</w:t>
+      </w:r>
+    </w:p>
+    <w:p>
+      <w:pPr>
+        <w:pBdr>
+          <w:bottom w:val="single" w:sz="4" w:space="4" w:color="EEEEEE"/>
+        </w:pBdr>
+      </w:pPr>
+    </w:p>
+    <w:p>
+      <w:r>
+        <w:rPr>
+          <w:b/>
+          <w:color w:val="D4A017"/>
+          <w:sz w:val="18"/>
+        </w:rPr>
+        <w:t xml:space="preserve">#90  </w:t>
+      </w:r>
+      <w:r>
+        <w:rPr>
+          <w:i/>
+          <w:color w:val="333333"/>
+          <w:sz w:val="19"/>
+        </w:rPr>
+        <w:t>"Crée un template de prompt réutilisable pour [tâche récurrente]. Avec variables entre [crochets] et instructions claires."</w:t>
+      </w:r>
+    </w:p>
+    <w:p>
+      <w:r>
+        <w:rPr>
+          <w:b/>
+          <w:color w:val="D4A017"/>
+          <w:sz w:val="17"/>
+        </w:rPr>
+        <w:t xml:space="preserve">Explication : </w:t>
+      </w:r>
+      <w:r>
+        <w:rPr>
+          <w:color w:val="555555"/>
+          <w:sz w:val="17"/>
+        </w:rPr>
+        <w:t>Gabarit paramétrable avec variables et structure fixe pour tâche récurrente.</w:t>
+      </w:r>
+    </w:p>
+    <w:p>
+      <w:r>
+        <w:rPr>
+          <w:b/>
+          <w:color w:val="D4A017"/>
+          <w:sz w:val="17"/>
+        </w:rPr>
+        <w:t xml:space="preserve">Utilise pour : </w:t>
+      </w:r>
+      <w:r>
+        <w:rPr>
+          <w:color w:val="555555"/>
+          <w:sz w:val="17"/>
+        </w:rPr>
+        <w:t>Automatisation, workflows répétitifs</w:t>
+      </w:r>
+    </w:p>
+    <w:p>
+      <w:pPr>
+        <w:pBdr>
+          <w:bottom w:val="single" w:sz="4" w:space="4" w:color="EEEEEE"/>
+        </w:pBdr>
+      </w:pPr>
+    </w:p>
+    <w:p>
+      <w:r>
+        <w:rPr>
+          <w:b/>
+          <w:color w:val="D4A017"/>
+          <w:sz w:val="18"/>
+        </w:rPr>
+        <w:t xml:space="preserve">#91  </w:t>
+      </w:r>
+      <w:r>
+        <w:rPr>
+          <w:i/>
+          <w:color w:val="333333"/>
+          <w:sz w:val="19"/>
+        </w:rPr>
+        <w:t>"Mon prompt [prompt] retourne parfois des erreurs. Quelles contraintes ajouter pour le rendre plus robuste ?"</w:t>
+      </w:r>
+    </w:p>
+    <w:p>
+      <w:r>
+        <w:rPr>
+          <w:b/>
+          <w:color w:val="D4A017"/>
+          <w:sz w:val="17"/>
+        </w:rPr>
+        <w:t xml:space="preserve">Explication : </w:t>
+      </w:r>
+      <w:r>
+        <w:rPr>
+          <w:color w:val="555555"/>
+          <w:sz w:val="17"/>
+        </w:rPr>
+        <w:t>Diagnostic et correction avec contraintes de robustesse.</w:t>
+      </w:r>
+    </w:p>
+    <w:p>
+      <w:r>
+        <w:rPr>
+          <w:b/>
+          <w:color w:val="D4A017"/>
+          <w:sz w:val="17"/>
+        </w:rPr>
+        <w:t xml:space="preserve">Utilise pour : </w:t>
+      </w:r>
+      <w:r>
+        <w:rPr>
+          <w:color w:val="555555"/>
+          <w:sz w:val="17"/>
+        </w:rPr>
+        <w:t>Fiabilité prompts, débogage</w:t>
+      </w:r>
+    </w:p>
+    <w:p>
+      <w:pPr>
+        <w:pBdr>
+          <w:bottom w:val="single" w:sz="4" w:space="4" w:color="EEEEEE"/>
+        </w:pBdr>
+      </w:pPr>
+    </w:p>
+    <w:p>
+      <w:r>
+        <w:rPr>
+          <w:b/>
+          <w:color w:val="D4A017"/>
+          <w:sz w:val="18"/>
+        </w:rPr>
+        <w:t xml:space="preserve">#92  </w:t>
+      </w:r>
+      <w:r>
+        <w:rPr>
+          <w:i/>
+          <w:color w:val="333333"/>
+          <w:sz w:val="19"/>
+        </w:rPr>
+        <w:t>"Transforme cette instruction vague '[instruction]' en prompt structuré avec : role, steps, output format, examples."</w:t>
+      </w:r>
+    </w:p>
+    <w:p>
+      <w:r>
+        <w:rPr>
+          <w:b/>
+          <w:color w:val="D4A017"/>
+          <w:sz w:val="17"/>
+        </w:rPr>
+        <w:t xml:space="preserve">Explication : </w:t>
+      </w:r>
+      <w:r>
+        <w:rPr>
+          <w:color w:val="555555"/>
+          <w:sz w:val="17"/>
+        </w:rPr>
+        <w:t>Convertit instruction floue en prompt structuré : role, steps, format, examples.</w:t>
+      </w:r>
+    </w:p>
+    <w:p>
+      <w:r>
+        <w:rPr>
+          <w:b/>
+          <w:color w:val="D4A017"/>
+          <w:sz w:val="17"/>
+        </w:rPr>
+        <w:t xml:space="preserve">Utilise pour : </w:t>
+      </w:r>
+      <w:r>
+        <w:rPr>
+          <w:color w:val="555555"/>
+          <w:sz w:val="17"/>
+        </w:rPr>
+        <w:t>Méthodologie, clarté, précision</w:t>
+      </w:r>
+    </w:p>
+    <w:p>
+      <w:pPr>
+        <w:pBdr>
+          <w:bottom w:val="single" w:sz="4" w:space="4" w:color="EEEEEE"/>
+        </w:pBdr>
+      </w:pPr>
+    </w:p>
+    <w:p>
+      <w:r>
+        <w:rPr>
+          <w:b/>
+          <w:color w:val="D4A017"/>
+          <w:sz w:val="18"/>
+        </w:rPr>
+        <w:t xml:space="preserve">#93  </w:t>
+      </w:r>
+      <w:r>
+        <w:rPr>
+          <w:i/>
+          <w:color w:val="333333"/>
+          <w:sz w:val="19"/>
+        </w:rPr>
+        <w:t>"Je veux un prompt pour [outil IA spécifique, ex: Claude, ChatGPT, Gemini]. Quelles différences de formulation adapter ?"</w:t>
+      </w:r>
+    </w:p>
+    <w:p>
+      <w:r>
+        <w:rPr>
+          <w:b/>
+          <w:color w:val="D4A017"/>
+          <w:sz w:val="17"/>
+        </w:rPr>
+        <w:t xml:space="preserve">Explication : </w:t>
+      </w:r>
+      <w:r>
+        <w:rPr>
+          <w:color w:val="555555"/>
+          <w:sz w:val="17"/>
+        </w:rPr>
+        <w:t>Adapte un prompt aux spécificités de chaque LLM (ChatGPT, Claude, Gemini).</w:t>
+      </w:r>
+    </w:p>
+    <w:p>
+      <w:r>
+        <w:rPr>
+          <w:b/>
+          <w:color w:val="D4A017"/>
+          <w:sz w:val="17"/>
+        </w:rPr>
+        <w:t xml:space="preserve">Utilise pour : </w:t>
+      </w:r>
+      <w:r>
+        <w:rPr>
+          <w:color w:val="555555"/>
+          <w:sz w:val="17"/>
+        </w:rPr>
+        <w:t>Optimisation par outil IA</w:t>
+      </w:r>
+    </w:p>
+    <w:p>
+      <w:pPr>
+        <w:pBdr>
+          <w:bottom w:val="single" w:sz="4" w:space="4" w:color="EEEEEE"/>
+        </w:pBdr>
+      </w:pPr>
+    </w:p>
+    <w:p>
+      <w:r>
+        <w:rPr>
+          <w:b/>
+          <w:color w:val="D4A017"/>
+          <w:sz w:val="18"/>
+        </w:rPr>
+        <w:t xml:space="preserve">#94  </w:t>
+      </w:r>
+      <w:r>
+        <w:rPr>
+          <w:i/>
+          <w:color w:val="333333"/>
+          <w:sz w:val="19"/>
+        </w:rPr>
+        <w:t>"Crée un système de few-shot prompting : 3 exemples entrée/sortie pour guider le modèle sur [tâche]."</w:t>
+      </w:r>
+    </w:p>
+    <w:p>
+      <w:r>
+        <w:rPr>
+          <w:b/>
+          <w:color w:val="D4A017"/>
+          <w:sz w:val="17"/>
+        </w:rPr>
+        <w:t xml:space="preserve">Explication : </w:t>
+      </w:r>
+      <w:r>
+        <w:rPr>
+          <w:color w:val="555555"/>
+          <w:sz w:val="17"/>
+        </w:rPr>
+        <w:t>Few-shot prompting : 3 exemples entrée/sortie pour guider le modèle.</w:t>
+      </w:r>
+    </w:p>
+    <w:p>
+      <w:r>
+        <w:rPr>
+          <w:b/>
+          <w:color w:val="D4A017"/>
+          <w:sz w:val="17"/>
+        </w:rPr>
+        <w:t xml:space="preserve">Utilise pour : </w:t>
+      </w:r>
+      <w:r>
+        <w:rPr>
+          <w:color w:val="555555"/>
+          <w:sz w:val="17"/>
+        </w:rPr>
+        <w:t>Précision, classification, extraction</w:t>
+      </w:r>
+    </w:p>
+    <w:p>
+      <w:pPr>
+        <w:pBdr>
+          <w:bottom w:val="single" w:sz="4" w:space="4" w:color="EEEEEE"/>
+        </w:pBdr>
+      </w:pPr>
+    </w:p>
+    <w:p>
+      <w:r>
+        <w:rPr>
+          <w:b/>
+          <w:color w:val="D4A017"/>
+          <w:sz w:val="18"/>
+        </w:rPr>
+        <w:t xml:space="preserve">#95  </w:t>
+      </w:r>
+      <w:r>
+        <w:rPr>
+          <w:i/>
+          <w:color w:val="333333"/>
+          <w:sz w:val="19"/>
+        </w:rPr>
+        <w:t>"Ajoute une étape de réflexion (chain-of-thought) à ce prompt [prompt] pour améliorer la qualité des réponses."</w:t>
+      </w:r>
+    </w:p>
+    <w:p>
+      <w:r>
+        <w:rPr>
+          <w:b/>
+          <w:color w:val="D4A017"/>
+          <w:sz w:val="17"/>
+        </w:rPr>
+        <w:t xml:space="preserve">Explication : </w:t>
+      </w:r>
+      <w:r>
+        <w:rPr>
+          <w:color w:val="555555"/>
+          <w:sz w:val="17"/>
+        </w:rPr>
+        <w:t>Ajoute chain-of-thought (raisonnement étape par étape) au prompt.</w:t>
+      </w:r>
+    </w:p>
+    <w:p>
+      <w:r>
+        <w:rPr>
+          <w:b/>
+          <w:color w:val="D4A017"/>
+          <w:sz w:val="17"/>
+        </w:rPr>
+        <w:t xml:space="preserve">Utilise pour : </w:t>
+      </w:r>
+      <w:r>
+        <w:rPr>
+          <w:color w:val="555555"/>
+          <w:sz w:val="17"/>
+        </w:rPr>
+        <w:t>Tâches complexes, logique, analyse</w:t>
+      </w:r>
+    </w:p>
+    <w:p>
+      <w:pPr>
+        <w:pBdr>
+          <w:bottom w:val="single" w:sz="4" w:space="4" w:color="EEEEEE"/>
+        </w:pBdr>
+      </w:pPr>
+    </w:p>
+    <w:p>
+      <w:r>
+        <w:rPr>
+          <w:b/>
+          <w:color w:val="D4A017"/>
+          <w:sz w:val="18"/>
+        </w:rPr>
+        <w:t xml:space="preserve">#96  </w:t>
+      </w:r>
+      <w:r>
+        <w:rPr>
+          <w:i/>
+          <w:color w:val="333333"/>
+          <w:sz w:val="19"/>
+        </w:rPr>
+        <w:t>"Génère un prompt négatif : dis à l'IA ce qu'elle NE doit PAS faire dans sa réponse pour éviter les erreurs connues."</w:t>
+      </w:r>
+    </w:p>
+    <w:p>
+      <w:r>
+        <w:rPr>
+          <w:b/>
+          <w:color w:val="D4A017"/>
+          <w:sz w:val="17"/>
+        </w:rPr>
+        <w:t xml:space="preserve">Explication : </w:t>
+      </w:r>
+      <w:r>
+        <w:rPr>
+          <w:color w:val="555555"/>
+          <w:sz w:val="17"/>
+        </w:rPr>
+        <w:t>Prompt négatif : liste ce que l'IA NE doit PAS faire.</w:t>
+      </w:r>
+    </w:p>
+    <w:p>
+      <w:r>
+        <w:rPr>
+          <w:b/>
+          <w:color w:val="D4A017"/>
+          <w:sz w:val="17"/>
+        </w:rPr>
+        <w:t xml:space="preserve">Utilise pour : </w:t>
+      </w:r>
+      <w:r>
+        <w:rPr>
+          <w:color w:val="555555"/>
+          <w:sz w:val="17"/>
+        </w:rPr>
+        <w:t>Réduction erreurs, contrôle qualité</w:t>
+      </w:r>
+    </w:p>
+    <w:p>
+      <w:pPr>
+        <w:pBdr>
+          <w:bottom w:val="single" w:sz="4" w:space="4" w:color="EEEEEE"/>
+        </w:pBdr>
+      </w:pPr>
+    </w:p>
+    <w:p>
+      <w:r>
+        <w:rPr>
+          <w:b/>
+          <w:color w:val="D4A017"/>
+          <w:sz w:val="18"/>
+        </w:rPr>
+        <w:t xml:space="preserve">#97  </w:t>
+      </w:r>
+      <w:r>
+        <w:rPr>
+          <w:i/>
+          <w:color w:val="333333"/>
+          <w:sz w:val="19"/>
+        </w:rPr>
+        <w:t>"Ce prompt est trop long. Réduis-le de 50% sans perdre les instructions essentielles."</w:t>
+      </w:r>
+    </w:p>
+    <w:p>
+      <w:r>
+        <w:rPr>
+          <w:b/>
+          <w:color w:val="D4A017"/>
+          <w:sz w:val="17"/>
+        </w:rPr>
+        <w:t xml:space="preserve">Explication : </w:t>
+      </w:r>
+      <w:r>
+        <w:rPr>
+          <w:color w:val="555555"/>
+          <w:sz w:val="17"/>
+        </w:rPr>
+        <w:t>Condense un prompt de 50% sans perdre les instructions essentielles.</w:t>
+      </w:r>
+    </w:p>
+    <w:p>
+      <w:r>
+        <w:rPr>
+          <w:b/>
+          <w:color w:val="D4A017"/>
+          <w:sz w:val="17"/>
+        </w:rPr>
+        <w:t xml:space="preserve">Utilise pour : </w:t>
+      </w:r>
+      <w:r>
+        <w:rPr>
+          <w:color w:val="555555"/>
+          <w:sz w:val="17"/>
+        </w:rPr>
+        <w:t>Prompts concis, économie tokens</w:t>
+      </w:r>
+    </w:p>
+    <w:p>
+      <w:pPr>
+        <w:pBdr>
+          <w:bottom w:val="single" w:sz="4" w:space="4" w:color="EEEEEE"/>
+        </w:pBdr>
+      </w:pPr>
+    </w:p>
+    <w:p>
+      <w:r>
+        <w:rPr>
+          <w:b/>
+          <w:color w:val="D4A017"/>
+          <w:sz w:val="18"/>
+        </w:rPr>
+        <w:t xml:space="preserve">#98  </w:t>
+      </w:r>
+      <w:r>
+        <w:rPr>
+          <w:i/>
+          <w:color w:val="333333"/>
+          <w:sz w:val="19"/>
+        </w:rPr>
+        <w:t>"Crée un meta-prompt qui demande à l'IA de générer 5 prompts différents pour [objectif], chacun avec un angle unique."</w:t>
+      </w:r>
+    </w:p>
+    <w:p>
+      <w:r>
+        <w:rPr>
+          <w:b/>
+          <w:color w:val="D4A017"/>
+          <w:sz w:val="17"/>
+        </w:rPr>
+        <w:t xml:space="preserve">Explication : </w:t>
+      </w:r>
+      <w:r>
+        <w:rPr>
+          <w:color w:val="555555"/>
+          <w:sz w:val="17"/>
+        </w:rPr>
+        <w:t>Meta-prompt : demande à l'IA de générer 5 prompts avec angles uniques.</w:t>
+      </w:r>
+    </w:p>
+    <w:p>
+      <w:r>
+        <w:rPr>
+          <w:b/>
+          <w:color w:val="D4A017"/>
+          <w:sz w:val="17"/>
+        </w:rPr>
+        <w:t xml:space="preserve">Utilise pour : </w:t>
+      </w:r>
+      <w:r>
+        <w:rPr>
+          <w:color w:val="555555"/>
+          <w:sz w:val="17"/>
+        </w:rPr>
+        <w:t>Brainstorming, créativité, inspiration</w:t>
+      </w:r>
+    </w:p>
+    <w:p>
+      <w:pPr>
+        <w:pBdr>
+          <w:bottom w:val="single" w:sz="4" w:space="4" w:color="EEEEEE"/>
+        </w:pBdr>
+      </w:pPr>
+    </w:p>
+    <w:p>
+      <w:r>
+        <w:rPr>
+          <w:b/>
+          <w:color w:val="D4A017"/>
+          <w:sz w:val="18"/>
+        </w:rPr>
+        <w:t xml:space="preserve">#99  </w:t>
+      </w:r>
+      <w:r>
+        <w:rPr>
+          <w:i/>
+          <w:color w:val="333333"/>
+          <w:sz w:val="19"/>
+        </w:rPr>
+        <w:t>"Je veux que l'IA adopte la persona de [expert] pour répondre à [question]. Génère le prompt avec background, ton, et style."</w:t>
+      </w:r>
+    </w:p>
+    <w:p>
+      <w:r>
+        <w:rPr>
+          <w:b/>
+          <w:color w:val="D4A017"/>
+          <w:sz w:val="17"/>
+        </w:rPr>
+        <w:t xml:space="preserve">Explication : </w:t>
+      </w:r>
+      <w:r>
+        <w:rPr>
+          <w:color w:val="555555"/>
+          <w:sz w:val="17"/>
+        </w:rPr>
+        <w:t>Prompt avec persona spécifique : background, ton, style pour crédibilité.</w:t>
+      </w:r>
+    </w:p>
+    <w:p>
+      <w:r>
+        <w:rPr>
+          <w:b/>
+          <w:color w:val="D4A017"/>
+          <w:sz w:val="17"/>
+        </w:rPr>
+        <w:t xml:space="preserve">Utilise pour : </w:t>
+      </w:r>
+      <w:r>
+        <w:rPr>
+          <w:color w:val="555555"/>
+          <w:sz w:val="17"/>
+        </w:rPr>
+        <w:t>Réponses spécialisées, rôle-playing</w:t>
+      </w:r>
+    </w:p>
+    <w:p>
+      <w:pPr>
+        <w:pBdr>
+          <w:bottom w:val="single" w:sz="4" w:space="4" w:color="EEEEEE"/>
+        </w:pBdr>
+      </w:pPr>
+    </w:p>
+    <w:p>
+      <w:r>
+        <w:rPr>
+          <w:b/>
+          <w:color w:val="D4A017"/>
+          <w:sz w:val="18"/>
+        </w:rPr>
+        <w:t xml:space="preserve">#100  </w:t>
+      </w:r>
+      <w:r>
+        <w:rPr>
+          <w:i/>
+          <w:color w:val="333333"/>
+          <w:sz w:val="19"/>
+        </w:rPr>
+        <w:t>"Analyse les 10 meilleurs prompts de ce pack. Quels patterns communs ? Qu'est-ce qui les rend efficaces ? Génère 5 nouveaux prompts en suivant ces patterns."</w:t>
+      </w:r>
+    </w:p>
+    <w:p>
+      <w:r>
+        <w:rPr>
+          <w:b/>
+          <w:color w:val="D4A017"/>
+          <w:sz w:val="17"/>
+        </w:rPr>
+        <w:t xml:space="preserve">Explication : </w:t>
+      </w:r>
+      <w:r>
+        <w:rPr>
+          <w:color w:val="555555"/>
+          <w:sz w:val="17"/>
+        </w:rPr>
+        <w:t>Analyse les meilleurs prompts, identifie les patterns, génère 5 nouveaux.</w:t>
+      </w:r>
+    </w:p>
+    <w:p>
+      <w:r>
+        <w:rPr>
+          <w:b/>
+          <w:color w:val="D4A017"/>
+          <w:sz w:val="17"/>
+        </w:rPr>
+        <w:t xml:space="preserve">Utilise pour : </w:t>
+      </w:r>
+      <w:r>
+        <w:rPr>
+          <w:color w:val="555555"/>
+          <w:sz w:val="17"/>
+        </w:rPr>
+        <w:t>Apprentissage, analyse performance</w:t>
+      </w:r>
+    </w:p>
+    <w:p>
+      <w:pPr>
+        <w:pBdr>
+          <w:bottom w:val="single" w:sz="4" w:space="4" w:color="EEEEEE"/>
+        </w:pBdr>
+      </w:pPr>
+    </w:p>
+    <w:p>
+      <w:r>
+        <w:br w:type="page"/>
+      </w:r>
+    </w:p>
+    <w:p>
+      <w:r>
+        <w:rPr>
+          <w:b/>
+          <w:color w:val="D4A017"/>
+          <w:sz w:val="28"/>
+        </w:rPr>
         <w:t>UTILISATION</w:t>
       </w:r>
     </w:p>
@@ -139,7 +4617,7 @@
           <w:color w:val="555555"/>
           <w:sz w:val="20"/>
         </w:rPr>
-        <w:t>• Copiez-collez ces prompts dans ChatGPT, Claude, Gemini ou tout LLM.</w:t>
+        <w:t xml:space="preserve">  Copiez-collez ces prompts dans ChatGPT, Claude, Gemini ou tout LLM.</w:t>
       </w:r>
     </w:p>
     <w:p>
@@ -148,7 +4626,7 @@
           <w:color w:val="555555"/>
           <w:sz w:val="20"/>
         </w:rPr>
-        <w:t>• Remplacez les [variables] entre crochets par votre contexte.</w:t>
+        <w:t xml:space="preserve">  Remplacez les [variables] entre crochets par votre contexte.</w:t>
       </w:r>
     </w:p>
     <w:p>
@@ -157,7 +4635,7 @@
           <w:color w:val="555555"/>
           <w:sz w:val="20"/>
         </w:rPr>
-        <w:t>• Ajoutez des contraintes de format si nécessaire (JSON, Markdown, etc.).</w:t>
+        <w:t xml:space="preserve">  Ajoutez des contraintes de format si necessaire (JSON, Markdown, etc.).</w:t>
       </w:r>
     </w:p>
     <w:p>
@@ -166,7 +4644,16 @@
           <w:color w:val="555555"/>
           <w:sz w:val="20"/>
         </w:rPr>
-        <w:t>• Pour le code, précisez la stack (React 18, Node 20, etc.).</w:t>
+        <w:t xml:space="preserve">  Pour le code, precisez la stack (React 18, Node 20, etc.).</w:t>
+      </w:r>
+    </w:p>
+    <w:p>
+      <w:r>
+        <w:rPr>
+          <w:color w:val="555555"/>
+          <w:sz w:val="20"/>
+        </w:rPr>
+        <w:t xml:space="preserve">  Chaque prompt est explique : lisez les sections pour savoir quand l'appliquer.</w:t>
       </w:r>
     </w:p>
     <w:p>
@@ -188,22 +4675,10 @@
       </w:pPr>
       <w:r>
         <w:rPr>
-          <w:color w:val="999999"/>
-          <w:sz w:val="18"/>
-        </w:rPr>
-        <w:t>ucfzem.github.io</w:t>
-      </w:r>
-    </w:p>
-    <w:p>
-      <w:pPr>
-        <w:jc w:val="center"/>
-      </w:pPr>
-      <w:r>
-        <w:rPr>
           <w:color w:val="BBBBBB"/>
           <w:sz w:val="16"/>
         </w:rPr>
-        <w:t>Construit depuis un Samsung S23 Ultra 🤳  •  2026</w:t>
+        <w:t>ucfzem.github.io - Construit depuis un Samsung S23 Ultra  | 2026</w:t>
       </w:r>
     </w:p>
     <w:sectPr>

</xml_diff>